<commit_message>
Add Customer Care & Technical Support page and explainer video
- New route /solutions/customer-care-technical-support (hero, answer, workstreams + video,
  6-step HowTo, human + AI model, why + anonymized proof, answers, 13 FAQs, contact)
- Confirmed facts: multilingual (no specific languages), IT help desk / service desk,
  ISO/IEC 27001:2022, HIPAA, GDPR; neutral transition and assessment timelines
- JSON-LD: Service with 24/7 hoursAvailable, Organization hasCredential, VideoObject
- Strategy doc updated with new keywords and resolved open items
- Navbar, footer and sitemap now list the page (live: true)

Co-Authored-By: Claude Opus 5.5 <noreply@anthropic.com>
Claude-Session: https://claude.ai/code/session_013wwRamYmoaCu2Jj7xRXZqL
</commit_message>
<xml_diff>
--- a/docs/Customer-Care-Technical-Support-Strategy.docx
+++ b/docs/Customer-Care-Technical-Support-Strategy.docx
@@ -309,7 +309,7 @@
           <w:sz w:val="21"/>
           <w:szCs w:val="21"/>
         </w:rPr>
-        <w:t xml:space="preserve"> a 2–3 week Customer Care Assessment with baseline KPIs, a service design with SLAs and an improvement roadmap.</w:t>
+        <w:t xml:space="preserve"> a Customer Care Assessment with baseline KPIs, a service design with SLAs, a transition plan and an improvement roadmap. No week counts are published until Delivery confirms them.</w:t>
       </w:r>
     </w:p>
     <w:p>
@@ -339,7 +339,7 @@
           <w:sz w:val="21"/>
           <w:szCs w:val="21"/>
         </w:rPr>
-        <w:t xml:space="preserve"> two primaries where TEAM's technical DNA is an advantage and competition is weak: "technical support outsourcing" (720/mo, KD 12) with "outsourced technical support" (880/mo, KD 12), and the higher-volume "customer support outsourcing" (2,900/mo, KD 30, CPC $72.74). With secondaries, the page targets about 18,000 US searches a month.</w:t>
+        <w:t xml:space="preserve"> two primaries where TEAM's technical DNA is an advantage and competition is weak: "technical support outsourcing" (720/mo, KD 12) with "outsourced technical support" (880/mo, KD 12), and the higher-volume "customer support outsourcing" (2,900/mo, KD 30, CPC $72.74). With secondaries, the page targets about 22,000 US searches a month.</w:t>
       </w:r>
     </w:p>
     <w:p>
@@ -399,7 +399,7 @@
           <w:sz w:val="21"/>
           <w:szCs w:val="21"/>
         </w:rPr>
-        <w:t xml:space="preserve"> about 500–900 organic visits a month to this page within 6–12 months (US only).</w:t>
+        <w:t xml:space="preserve"> about 600–1,000 organic visits a month to this page within 6–12 months (US only).</w:t>
       </w:r>
     </w:p>
     <w:p>
@@ -1385,7 +1385,7 @@
                 <w:sz w:val="18"/>
                 <w:szCs w:val="18"/>
               </w:rPr>
-              <w:t xml:space="preserve">Outsourced technical support, help desk outsourcing and customer care across tiers and channels, with agents trained on your products and specialists for complex technical issues, 24/7.</w:t>
+              <w:t xml:space="preserve">Outsourced technical support, customer care and IT help desk outsourcing across tiers and channels, with multilingual agents trained on your products and specialists for complex technical issues, 24/7.</w:t>
             </w:r>
           </w:p>
         </w:tc>
@@ -3186,7 +3186,7 @@
                 <w:sz w:val="18"/>
                 <w:szCs w:val="18"/>
               </w:rPr>
-              <w:t xml:space="preserve">Target only if TEAM offers internal IT service desk (see Open items)</w:t>
+              <w:t xml:space="preserve">Confirmed: TEAM runs help desk, service desk and IT desktop support (Contact Center Projects tab). Now targeted on this page</w:t>
             </w:r>
           </w:p>
         </w:tc>
@@ -3216,7 +3216,7 @@
           <w:sz w:val="21"/>
           <w:szCs w:val="21"/>
         </w:rPr>
-        <w:t xml:space="preserve">The 19 keywords in section 7 total about 18,000 US searches a month. Ranking top 5 for most of the KD ≤ 25 terms and top 10 for the KD 28–30 terms, discounted for AI Overviews, gives about 500–900 visits a month within 6–12 months, in the US alone. CPCs of $30–$73 show these are high-value buyer searches.</w:t>
+        <w:t xml:space="preserve">The 26 keywords in section 7 total about 22,000 US searches a month. Ranking top 5 for most of the KD ≤ 25 terms and top 10 for the KD 28–30 terms, discounted for AI Overviews, gives about 600–1,000 visits a month within 6–12 months, in the US alone. CPCs of $30–$73 show these are high-value buyer searches.</w:t>
       </w:r>
     </w:p>
     <w:p>
@@ -9999,6 +9999,1451 @@
           </w:p>
         </w:tc>
       </w:tr>
+      <w:tr>
+        <w:trPr>
+          <w:cantSplit/>
+        </w:trPr>
+        <w:tc>
+          <w:tcPr>
+            <w:tcW w:type="dxa" w:w="2700"/>
+            <w:tcBorders>
+              <w:top w:val="single" w:color="D9D3D7" w:sz="4"/>
+              <w:left w:val="single" w:color="D9D3D7" w:sz="4"/>
+              <w:bottom w:val="single" w:color="D9D3D7" w:sz="4"/>
+              <w:right w:val="single" w:color="D9D3D7" w:sz="4"/>
+            </w:tcBorders>
+            <w:shd w:fill="F7F4F6" w:color="auto" w:val="clear"/>
+            <w:tcMar>
+              <w:top w:type="dxa" w:w="70"/>
+              <w:left w:type="dxa" w:w="100"/>
+              <w:bottom w:type="dxa" w:w="70"/>
+              <w:right w:type="dxa" w:w="100"/>
+            </w:tcMar>
+          </w:tcPr>
+          <w:p>
+            <w:pPr>
+              <w:jc w:val="left"/>
+            </w:pPr>
+            <w:r>
+              <w:rPr>
+                <w:rFonts w:ascii="Aptos" w:cs="Aptos" w:eastAsia="Aptos" w:hAnsi="Aptos"/>
+                <w:b/>
+                <w:bCs/>
+                <w:color w:val="2F282D"/>
+                <w:sz w:val="18"/>
+                <w:szCs w:val="18"/>
+              </w:rPr>
+              <w:t xml:space="preserve">it help desk outsourcing</w:t>
+            </w:r>
+          </w:p>
+        </w:tc>
+        <w:tc>
+          <w:tcPr>
+            <w:tcW w:type="dxa" w:w="1300"/>
+            <w:tcBorders>
+              <w:top w:val="single" w:color="D9D3D7" w:sz="4"/>
+              <w:left w:val="single" w:color="D9D3D7" w:sz="4"/>
+              <w:bottom w:val="single" w:color="D9D3D7" w:sz="4"/>
+              <w:right w:val="single" w:color="D9D3D7" w:sz="4"/>
+            </w:tcBorders>
+            <w:shd w:fill="F7F4F6" w:color="auto" w:val="clear"/>
+            <w:tcMar>
+              <w:top w:type="dxa" w:w="70"/>
+              <w:left w:type="dxa" w:w="100"/>
+              <w:bottom w:type="dxa" w:w="70"/>
+              <w:right w:type="dxa" w:w="100"/>
+            </w:tcMar>
+          </w:tcPr>
+          <w:p>
+            <w:pPr>
+              <w:jc w:val="left"/>
+            </w:pPr>
+            <w:r>
+              <w:rPr>
+                <w:rFonts w:ascii="Aptos" w:cs="Aptos" w:eastAsia="Aptos" w:hAnsi="Aptos"/>
+                <w:b w:val="false"/>
+                <w:bCs w:val="false"/>
+                <w:color w:val="2F282D"/>
+                <w:sz w:val="18"/>
+                <w:szCs w:val="18"/>
+              </w:rPr>
+              <w:t xml:space="preserve">Secondary</w:t>
+            </w:r>
+          </w:p>
+        </w:tc>
+        <w:tc>
+          <w:tcPr>
+            <w:tcW w:type="dxa" w:w="800"/>
+            <w:tcBorders>
+              <w:top w:val="single" w:color="D9D3D7" w:sz="4"/>
+              <w:left w:val="single" w:color="D9D3D7" w:sz="4"/>
+              <w:bottom w:val="single" w:color="D9D3D7" w:sz="4"/>
+              <w:right w:val="single" w:color="D9D3D7" w:sz="4"/>
+            </w:tcBorders>
+            <w:shd w:fill="F7F4F6" w:color="auto" w:val="clear"/>
+            <w:tcMar>
+              <w:top w:type="dxa" w:w="70"/>
+              <w:left w:type="dxa" w:w="100"/>
+              <w:bottom w:type="dxa" w:w="70"/>
+              <w:right w:type="dxa" w:w="100"/>
+            </w:tcMar>
+          </w:tcPr>
+          <w:p>
+            <w:pPr>
+              <w:jc w:val="right"/>
+            </w:pPr>
+            <w:r>
+              <w:rPr>
+                <w:rFonts w:ascii="Aptos" w:cs="Aptos" w:eastAsia="Aptos" w:hAnsi="Aptos"/>
+                <w:b w:val="false"/>
+                <w:bCs w:val="false"/>
+                <w:color w:val="2F282D"/>
+                <w:sz w:val="18"/>
+                <w:szCs w:val="18"/>
+              </w:rPr>
+              <w:t xml:space="preserve">1,300</w:t>
+            </w:r>
+          </w:p>
+        </w:tc>
+        <w:tc>
+          <w:tcPr>
+            <w:tcW w:type="dxa" w:w="500"/>
+            <w:tcBorders>
+              <w:top w:val="single" w:color="D9D3D7" w:sz="4"/>
+              <w:left w:val="single" w:color="D9D3D7" w:sz="4"/>
+              <w:bottom w:val="single" w:color="D9D3D7" w:sz="4"/>
+              <w:right w:val="single" w:color="D9D3D7" w:sz="4"/>
+            </w:tcBorders>
+            <w:shd w:fill="F7F4F6" w:color="auto" w:val="clear"/>
+            <w:tcMar>
+              <w:top w:type="dxa" w:w="70"/>
+              <w:left w:type="dxa" w:w="100"/>
+              <w:bottom w:type="dxa" w:w="70"/>
+              <w:right w:type="dxa" w:w="100"/>
+            </w:tcMar>
+          </w:tcPr>
+          <w:p>
+            <w:pPr>
+              <w:jc w:val="right"/>
+            </w:pPr>
+            <w:r>
+              <w:rPr>
+                <w:rFonts w:ascii="Aptos" w:cs="Aptos" w:eastAsia="Aptos" w:hAnsi="Aptos"/>
+                <w:b w:val="false"/>
+                <w:bCs w:val="false"/>
+                <w:color w:val="2F282D"/>
+                <w:sz w:val="18"/>
+                <w:szCs w:val="18"/>
+              </w:rPr>
+              <w:t xml:space="preserve">20</w:t>
+            </w:r>
+          </w:p>
+        </w:tc>
+        <w:tc>
+          <w:tcPr>
+            <w:tcW w:type="dxa" w:w="800"/>
+            <w:tcBorders>
+              <w:top w:val="single" w:color="D9D3D7" w:sz="4"/>
+              <w:left w:val="single" w:color="D9D3D7" w:sz="4"/>
+              <w:bottom w:val="single" w:color="D9D3D7" w:sz="4"/>
+              <w:right w:val="single" w:color="D9D3D7" w:sz="4"/>
+            </w:tcBorders>
+            <w:shd w:fill="F7F4F6" w:color="auto" w:val="clear"/>
+            <w:tcMar>
+              <w:top w:type="dxa" w:w="70"/>
+              <w:left w:type="dxa" w:w="100"/>
+              <w:bottom w:type="dxa" w:w="70"/>
+              <w:right w:type="dxa" w:w="100"/>
+            </w:tcMar>
+          </w:tcPr>
+          <w:p>
+            <w:pPr>
+              <w:jc w:val="right"/>
+            </w:pPr>
+            <w:r>
+              <w:rPr>
+                <w:rFonts w:ascii="Aptos" w:cs="Aptos" w:eastAsia="Aptos" w:hAnsi="Aptos"/>
+                <w:b w:val="false"/>
+                <w:bCs w:val="false"/>
+                <w:color w:val="2F282D"/>
+                <w:sz w:val="18"/>
+                <w:szCs w:val="18"/>
+              </w:rPr>
+              <w:t xml:space="preserve">77.95</w:t>
+            </w:r>
+          </w:p>
+        </w:tc>
+        <w:tc>
+          <w:tcPr>
+            <w:tcW w:type="dxa" w:w="3260"/>
+            <w:tcBorders>
+              <w:top w:val="single" w:color="D9D3D7" w:sz="4"/>
+              <w:left w:val="single" w:color="D9D3D7" w:sz="4"/>
+              <w:bottom w:val="single" w:color="D9D3D7" w:sz="4"/>
+              <w:right w:val="single" w:color="D9D3D7" w:sz="4"/>
+            </w:tcBorders>
+            <w:shd w:fill="F7F4F6" w:color="auto" w:val="clear"/>
+            <w:tcMar>
+              <w:top w:type="dxa" w:w="70"/>
+              <w:left w:type="dxa" w:w="100"/>
+              <w:bottom w:type="dxa" w:w="70"/>
+              <w:right w:type="dxa" w:w="100"/>
+            </w:tcMar>
+          </w:tcPr>
+          <w:p>
+            <w:pPr>
+              <w:jc w:val="left"/>
+            </w:pPr>
+            <w:r>
+              <w:rPr>
+                <w:rFonts w:ascii="Aptos" w:cs="Aptos" w:eastAsia="Aptos" w:hAnsi="Aptos"/>
+                <w:b w:val="false"/>
+                <w:bCs w:val="false"/>
+                <w:color w:val="2F282D"/>
+                <w:sz w:val="18"/>
+                <w:szCs w:val="18"/>
+              </w:rPr>
+              <w:t xml:space="preserve">Confirmed capability: help desk / service desk deals won</w:t>
+            </w:r>
+          </w:p>
+        </w:tc>
+      </w:tr>
+      <w:tr>
+        <w:trPr>
+          <w:cantSplit/>
+        </w:trPr>
+        <w:tc>
+          <w:tcPr>
+            <w:tcW w:type="dxa" w:w="2700"/>
+            <w:tcBorders>
+              <w:top w:val="single" w:color="D9D3D7" w:sz="4"/>
+              <w:left w:val="single" w:color="D9D3D7" w:sz="4"/>
+              <w:bottom w:val="single" w:color="D9D3D7" w:sz="4"/>
+              <w:right w:val="single" w:color="D9D3D7" w:sz="4"/>
+            </w:tcBorders>
+            <w:tcMar>
+              <w:top w:type="dxa" w:w="70"/>
+              <w:left w:type="dxa" w:w="100"/>
+              <w:bottom w:type="dxa" w:w="70"/>
+              <w:right w:type="dxa" w:w="100"/>
+            </w:tcMar>
+          </w:tcPr>
+          <w:p>
+            <w:pPr>
+              <w:jc w:val="left"/>
+            </w:pPr>
+            <w:r>
+              <w:rPr>
+                <w:rFonts w:ascii="Aptos" w:cs="Aptos" w:eastAsia="Aptos" w:hAnsi="Aptos"/>
+                <w:b/>
+                <w:bCs/>
+                <w:color w:val="2F282D"/>
+                <w:sz w:val="18"/>
+                <w:szCs w:val="18"/>
+              </w:rPr>
+              <w:t xml:space="preserve">service desk outsourcing</w:t>
+            </w:r>
+          </w:p>
+        </w:tc>
+        <w:tc>
+          <w:tcPr>
+            <w:tcW w:type="dxa" w:w="1300"/>
+            <w:tcBorders>
+              <w:top w:val="single" w:color="D9D3D7" w:sz="4"/>
+              <w:left w:val="single" w:color="D9D3D7" w:sz="4"/>
+              <w:bottom w:val="single" w:color="D9D3D7" w:sz="4"/>
+              <w:right w:val="single" w:color="D9D3D7" w:sz="4"/>
+            </w:tcBorders>
+            <w:tcMar>
+              <w:top w:type="dxa" w:w="70"/>
+              <w:left w:type="dxa" w:w="100"/>
+              <w:bottom w:type="dxa" w:w="70"/>
+              <w:right w:type="dxa" w:w="100"/>
+            </w:tcMar>
+          </w:tcPr>
+          <w:p>
+            <w:pPr>
+              <w:jc w:val="left"/>
+            </w:pPr>
+            <w:r>
+              <w:rPr>
+                <w:rFonts w:ascii="Aptos" w:cs="Aptos" w:eastAsia="Aptos" w:hAnsi="Aptos"/>
+                <w:b w:val="false"/>
+                <w:bCs w:val="false"/>
+                <w:color w:val="2F282D"/>
+                <w:sz w:val="18"/>
+                <w:szCs w:val="18"/>
+              </w:rPr>
+              <w:t xml:space="preserve">Secondary</w:t>
+            </w:r>
+          </w:p>
+        </w:tc>
+        <w:tc>
+          <w:tcPr>
+            <w:tcW w:type="dxa" w:w="800"/>
+            <w:tcBorders>
+              <w:top w:val="single" w:color="D9D3D7" w:sz="4"/>
+              <w:left w:val="single" w:color="D9D3D7" w:sz="4"/>
+              <w:bottom w:val="single" w:color="D9D3D7" w:sz="4"/>
+              <w:right w:val="single" w:color="D9D3D7" w:sz="4"/>
+            </w:tcBorders>
+            <w:tcMar>
+              <w:top w:type="dxa" w:w="70"/>
+              <w:left w:type="dxa" w:w="100"/>
+              <w:bottom w:type="dxa" w:w="70"/>
+              <w:right w:type="dxa" w:w="100"/>
+            </w:tcMar>
+          </w:tcPr>
+          <w:p>
+            <w:pPr>
+              <w:jc w:val="right"/>
+            </w:pPr>
+            <w:r>
+              <w:rPr>
+                <w:rFonts w:ascii="Aptos" w:cs="Aptos" w:eastAsia="Aptos" w:hAnsi="Aptos"/>
+                <w:b w:val="false"/>
+                <w:bCs w:val="false"/>
+                <w:color w:val="2F282D"/>
+                <w:sz w:val="18"/>
+                <w:szCs w:val="18"/>
+              </w:rPr>
+              <w:t xml:space="preserve">590</w:t>
+            </w:r>
+          </w:p>
+        </w:tc>
+        <w:tc>
+          <w:tcPr>
+            <w:tcW w:type="dxa" w:w="500"/>
+            <w:tcBorders>
+              <w:top w:val="single" w:color="D9D3D7" w:sz="4"/>
+              <w:left w:val="single" w:color="D9D3D7" w:sz="4"/>
+              <w:bottom w:val="single" w:color="D9D3D7" w:sz="4"/>
+              <w:right w:val="single" w:color="D9D3D7" w:sz="4"/>
+            </w:tcBorders>
+            <w:tcMar>
+              <w:top w:type="dxa" w:w="70"/>
+              <w:left w:type="dxa" w:w="100"/>
+              <w:bottom w:type="dxa" w:w="70"/>
+              <w:right w:type="dxa" w:w="100"/>
+            </w:tcMar>
+          </w:tcPr>
+          <w:p>
+            <w:pPr>
+              <w:jc w:val="right"/>
+            </w:pPr>
+            <w:r>
+              <w:rPr>
+                <w:rFonts w:ascii="Aptos" w:cs="Aptos" w:eastAsia="Aptos" w:hAnsi="Aptos"/>
+                <w:b w:val="false"/>
+                <w:bCs w:val="false"/>
+                <w:color w:val="2F282D"/>
+                <w:sz w:val="18"/>
+                <w:szCs w:val="18"/>
+              </w:rPr>
+              <w:t xml:space="preserve">13</w:t>
+            </w:r>
+          </w:p>
+        </w:tc>
+        <w:tc>
+          <w:tcPr>
+            <w:tcW w:type="dxa" w:w="800"/>
+            <w:tcBorders>
+              <w:top w:val="single" w:color="D9D3D7" w:sz="4"/>
+              <w:left w:val="single" w:color="D9D3D7" w:sz="4"/>
+              <w:bottom w:val="single" w:color="D9D3D7" w:sz="4"/>
+              <w:right w:val="single" w:color="D9D3D7" w:sz="4"/>
+            </w:tcBorders>
+            <w:tcMar>
+              <w:top w:type="dxa" w:w="70"/>
+              <w:left w:type="dxa" w:w="100"/>
+              <w:bottom w:type="dxa" w:w="70"/>
+              <w:right w:type="dxa" w:w="100"/>
+            </w:tcMar>
+          </w:tcPr>
+          <w:p>
+            <w:pPr>
+              <w:jc w:val="right"/>
+            </w:pPr>
+            <w:r>
+              <w:rPr>
+                <w:rFonts w:ascii="Aptos" w:cs="Aptos" w:eastAsia="Aptos" w:hAnsi="Aptos"/>
+                <w:b w:val="false"/>
+                <w:bCs w:val="false"/>
+                <w:color w:val="2F282D"/>
+                <w:sz w:val="18"/>
+                <w:szCs w:val="18"/>
+              </w:rPr>
+              <w:t xml:space="preserve">58.48</w:t>
+            </w:r>
+          </w:p>
+        </w:tc>
+        <w:tc>
+          <w:tcPr>
+            <w:tcW w:type="dxa" w:w="3260"/>
+            <w:tcBorders>
+              <w:top w:val="single" w:color="D9D3D7" w:sz="4"/>
+              <w:left w:val="single" w:color="D9D3D7" w:sz="4"/>
+              <w:bottom w:val="single" w:color="D9D3D7" w:sz="4"/>
+              <w:right w:val="single" w:color="D9D3D7" w:sz="4"/>
+            </w:tcBorders>
+            <w:tcMar>
+              <w:top w:type="dxa" w:w="70"/>
+              <w:left w:type="dxa" w:w="100"/>
+              <w:bottom w:type="dxa" w:w="70"/>
+              <w:right w:type="dxa" w:w="100"/>
+            </w:tcMar>
+          </w:tcPr>
+          <w:p>
+            <w:pPr>
+              <w:jc w:val="left"/>
+            </w:pPr>
+            <w:r>
+              <w:rPr>
+                <w:rFonts w:ascii="Aptos" w:cs="Aptos" w:eastAsia="Aptos" w:hAnsi="Aptos"/>
+                <w:b w:val="false"/>
+                <w:bCs w:val="false"/>
+                <w:color w:val="2F282D"/>
+                <w:sz w:val="18"/>
+                <w:szCs w:val="18"/>
+              </w:rPr>
+              <w:t xml:space="preserve">Very easy; confirmed capability</w:t>
+            </w:r>
+          </w:p>
+        </w:tc>
+      </w:tr>
+      <w:tr>
+        <w:trPr>
+          <w:cantSplit/>
+        </w:trPr>
+        <w:tc>
+          <w:tcPr>
+            <w:tcW w:type="dxa" w:w="2700"/>
+            <w:tcBorders>
+              <w:top w:val="single" w:color="D9D3D7" w:sz="4"/>
+              <w:left w:val="single" w:color="D9D3D7" w:sz="4"/>
+              <w:bottom w:val="single" w:color="D9D3D7" w:sz="4"/>
+              <w:right w:val="single" w:color="D9D3D7" w:sz="4"/>
+            </w:tcBorders>
+            <w:shd w:fill="F7F4F6" w:color="auto" w:val="clear"/>
+            <w:tcMar>
+              <w:top w:type="dxa" w:w="70"/>
+              <w:left w:type="dxa" w:w="100"/>
+              <w:bottom w:type="dxa" w:w="70"/>
+              <w:right w:type="dxa" w:w="100"/>
+            </w:tcMar>
+          </w:tcPr>
+          <w:p>
+            <w:pPr>
+              <w:jc w:val="left"/>
+            </w:pPr>
+            <w:r>
+              <w:rPr>
+                <w:rFonts w:ascii="Aptos" w:cs="Aptos" w:eastAsia="Aptos" w:hAnsi="Aptos"/>
+                <w:b/>
+                <w:bCs/>
+                <w:color w:val="2F282D"/>
+                <w:sz w:val="18"/>
+                <w:szCs w:val="18"/>
+              </w:rPr>
+              <w:t xml:space="preserve">outsourced it help desk</w:t>
+            </w:r>
+          </w:p>
+        </w:tc>
+        <w:tc>
+          <w:tcPr>
+            <w:tcW w:type="dxa" w:w="1300"/>
+            <w:tcBorders>
+              <w:top w:val="single" w:color="D9D3D7" w:sz="4"/>
+              <w:left w:val="single" w:color="D9D3D7" w:sz="4"/>
+              <w:bottom w:val="single" w:color="D9D3D7" w:sz="4"/>
+              <w:right w:val="single" w:color="D9D3D7" w:sz="4"/>
+            </w:tcBorders>
+            <w:shd w:fill="F7F4F6" w:color="auto" w:val="clear"/>
+            <w:tcMar>
+              <w:top w:type="dxa" w:w="70"/>
+              <w:left w:type="dxa" w:w="100"/>
+              <w:bottom w:type="dxa" w:w="70"/>
+              <w:right w:type="dxa" w:w="100"/>
+            </w:tcMar>
+          </w:tcPr>
+          <w:p>
+            <w:pPr>
+              <w:jc w:val="left"/>
+            </w:pPr>
+            <w:r>
+              <w:rPr>
+                <w:rFonts w:ascii="Aptos" w:cs="Aptos" w:eastAsia="Aptos" w:hAnsi="Aptos"/>
+                <w:b w:val="false"/>
+                <w:bCs w:val="false"/>
+                <w:color w:val="2F282D"/>
+                <w:sz w:val="18"/>
+                <w:szCs w:val="18"/>
+              </w:rPr>
+              <w:t xml:space="preserve">Secondary</w:t>
+            </w:r>
+          </w:p>
+        </w:tc>
+        <w:tc>
+          <w:tcPr>
+            <w:tcW w:type="dxa" w:w="800"/>
+            <w:tcBorders>
+              <w:top w:val="single" w:color="D9D3D7" w:sz="4"/>
+              <w:left w:val="single" w:color="D9D3D7" w:sz="4"/>
+              <w:bottom w:val="single" w:color="D9D3D7" w:sz="4"/>
+              <w:right w:val="single" w:color="D9D3D7" w:sz="4"/>
+            </w:tcBorders>
+            <w:shd w:fill="F7F4F6" w:color="auto" w:val="clear"/>
+            <w:tcMar>
+              <w:top w:type="dxa" w:w="70"/>
+              <w:left w:type="dxa" w:w="100"/>
+              <w:bottom w:type="dxa" w:w="70"/>
+              <w:right w:type="dxa" w:w="100"/>
+            </w:tcMar>
+          </w:tcPr>
+          <w:p>
+            <w:pPr>
+              <w:jc w:val="right"/>
+            </w:pPr>
+            <w:r>
+              <w:rPr>
+                <w:rFonts w:ascii="Aptos" w:cs="Aptos" w:eastAsia="Aptos" w:hAnsi="Aptos"/>
+                <w:b w:val="false"/>
+                <w:bCs w:val="false"/>
+                <w:color w:val="2F282D"/>
+                <w:sz w:val="18"/>
+                <w:szCs w:val="18"/>
+              </w:rPr>
+              <w:t xml:space="preserve">320</w:t>
+            </w:r>
+          </w:p>
+        </w:tc>
+        <w:tc>
+          <w:tcPr>
+            <w:tcW w:type="dxa" w:w="500"/>
+            <w:tcBorders>
+              <w:top w:val="single" w:color="D9D3D7" w:sz="4"/>
+              <w:left w:val="single" w:color="D9D3D7" w:sz="4"/>
+              <w:bottom w:val="single" w:color="D9D3D7" w:sz="4"/>
+              <w:right w:val="single" w:color="D9D3D7" w:sz="4"/>
+            </w:tcBorders>
+            <w:shd w:fill="F7F4F6" w:color="auto" w:val="clear"/>
+            <w:tcMar>
+              <w:top w:type="dxa" w:w="70"/>
+              <w:left w:type="dxa" w:w="100"/>
+              <w:bottom w:type="dxa" w:w="70"/>
+              <w:right w:type="dxa" w:w="100"/>
+            </w:tcMar>
+          </w:tcPr>
+          <w:p>
+            <w:pPr>
+              <w:jc w:val="right"/>
+            </w:pPr>
+            <w:r>
+              <w:rPr>
+                <w:rFonts w:ascii="Aptos" w:cs="Aptos" w:eastAsia="Aptos" w:hAnsi="Aptos"/>
+                <w:b w:val="false"/>
+                <w:bCs w:val="false"/>
+                <w:color w:val="2F282D"/>
+                <w:sz w:val="18"/>
+                <w:szCs w:val="18"/>
+              </w:rPr>
+              <w:t xml:space="preserve">17</w:t>
+            </w:r>
+          </w:p>
+        </w:tc>
+        <w:tc>
+          <w:tcPr>
+            <w:tcW w:type="dxa" w:w="800"/>
+            <w:tcBorders>
+              <w:top w:val="single" w:color="D9D3D7" w:sz="4"/>
+              <w:left w:val="single" w:color="D9D3D7" w:sz="4"/>
+              <w:bottom w:val="single" w:color="D9D3D7" w:sz="4"/>
+              <w:right w:val="single" w:color="D9D3D7" w:sz="4"/>
+            </w:tcBorders>
+            <w:shd w:fill="F7F4F6" w:color="auto" w:val="clear"/>
+            <w:tcMar>
+              <w:top w:type="dxa" w:w="70"/>
+              <w:left w:type="dxa" w:w="100"/>
+              <w:bottom w:type="dxa" w:w="70"/>
+              <w:right w:type="dxa" w:w="100"/>
+            </w:tcMar>
+          </w:tcPr>
+          <w:p>
+            <w:pPr>
+              <w:jc w:val="right"/>
+            </w:pPr>
+            <w:r>
+              <w:rPr>
+                <w:rFonts w:ascii="Aptos" w:cs="Aptos" w:eastAsia="Aptos" w:hAnsi="Aptos"/>
+                <w:b w:val="false"/>
+                <w:bCs w:val="false"/>
+                <w:color w:val="2F282D"/>
+                <w:sz w:val="18"/>
+                <w:szCs w:val="18"/>
+              </w:rPr>
+              <w:t xml:space="preserve">58.48</w:t>
+            </w:r>
+          </w:p>
+        </w:tc>
+        <w:tc>
+          <w:tcPr>
+            <w:tcW w:type="dxa" w:w="3260"/>
+            <w:tcBorders>
+              <w:top w:val="single" w:color="D9D3D7" w:sz="4"/>
+              <w:left w:val="single" w:color="D9D3D7" w:sz="4"/>
+              <w:bottom w:val="single" w:color="D9D3D7" w:sz="4"/>
+              <w:right w:val="single" w:color="D9D3D7" w:sz="4"/>
+            </w:tcBorders>
+            <w:shd w:fill="F7F4F6" w:color="auto" w:val="clear"/>
+            <w:tcMar>
+              <w:top w:type="dxa" w:w="70"/>
+              <w:left w:type="dxa" w:w="100"/>
+              <w:bottom w:type="dxa" w:w="70"/>
+              <w:right w:type="dxa" w:w="100"/>
+            </w:tcMar>
+          </w:tcPr>
+          <w:p>
+            <w:pPr>
+              <w:jc w:val="left"/>
+            </w:pPr>
+            <w:r>
+              <w:rPr>
+                <w:rFonts w:ascii="Aptos" w:cs="Aptos" w:eastAsia="Aptos" w:hAnsi="Aptos"/>
+                <w:b w:val="false"/>
+                <w:bCs w:val="false"/>
+                <w:color w:val="2F282D"/>
+                <w:sz w:val="18"/>
+                <w:szCs w:val="18"/>
+              </w:rPr>
+              <w:t xml:space="preserve">Variant of IT help desk outsourcing</w:t>
+            </w:r>
+          </w:p>
+        </w:tc>
+      </w:tr>
+      <w:tr>
+        <w:trPr>
+          <w:cantSplit/>
+        </w:trPr>
+        <w:tc>
+          <w:tcPr>
+            <w:tcW w:type="dxa" w:w="2700"/>
+            <w:tcBorders>
+              <w:top w:val="single" w:color="D9D3D7" w:sz="4"/>
+              <w:left w:val="single" w:color="D9D3D7" w:sz="4"/>
+              <w:bottom w:val="single" w:color="D9D3D7" w:sz="4"/>
+              <w:right w:val="single" w:color="D9D3D7" w:sz="4"/>
+            </w:tcBorders>
+            <w:tcMar>
+              <w:top w:type="dxa" w:w="70"/>
+              <w:left w:type="dxa" w:w="100"/>
+              <w:bottom w:type="dxa" w:w="70"/>
+              <w:right w:type="dxa" w:w="100"/>
+            </w:tcMar>
+          </w:tcPr>
+          <w:p>
+            <w:pPr>
+              <w:jc w:val="left"/>
+            </w:pPr>
+            <w:r>
+              <w:rPr>
+                <w:rFonts w:ascii="Aptos" w:cs="Aptos" w:eastAsia="Aptos" w:hAnsi="Aptos"/>
+                <w:b/>
+                <w:bCs/>
+                <w:color w:val="2F282D"/>
+                <w:sz w:val="18"/>
+                <w:szCs w:val="18"/>
+              </w:rPr>
+              <w:t xml:space="preserve">multilingual customer support</w:t>
+            </w:r>
+          </w:p>
+        </w:tc>
+        <w:tc>
+          <w:tcPr>
+            <w:tcW w:type="dxa" w:w="1300"/>
+            <w:tcBorders>
+              <w:top w:val="single" w:color="D9D3D7" w:sz="4"/>
+              <w:left w:val="single" w:color="D9D3D7" w:sz="4"/>
+              <w:bottom w:val="single" w:color="D9D3D7" w:sz="4"/>
+              <w:right w:val="single" w:color="D9D3D7" w:sz="4"/>
+            </w:tcBorders>
+            <w:tcMar>
+              <w:top w:type="dxa" w:w="70"/>
+              <w:left w:type="dxa" w:w="100"/>
+              <w:bottom w:type="dxa" w:w="70"/>
+              <w:right w:type="dxa" w:w="100"/>
+            </w:tcMar>
+          </w:tcPr>
+          <w:p>
+            <w:pPr>
+              <w:jc w:val="left"/>
+            </w:pPr>
+            <w:r>
+              <w:rPr>
+                <w:rFonts w:ascii="Aptos" w:cs="Aptos" w:eastAsia="Aptos" w:hAnsi="Aptos"/>
+                <w:b w:val="false"/>
+                <w:bCs w:val="false"/>
+                <w:color w:val="2F282D"/>
+                <w:sz w:val="18"/>
+                <w:szCs w:val="18"/>
+              </w:rPr>
+              <w:t xml:space="preserve">Secondary</w:t>
+            </w:r>
+          </w:p>
+        </w:tc>
+        <w:tc>
+          <w:tcPr>
+            <w:tcW w:type="dxa" w:w="800"/>
+            <w:tcBorders>
+              <w:top w:val="single" w:color="D9D3D7" w:sz="4"/>
+              <w:left w:val="single" w:color="D9D3D7" w:sz="4"/>
+              <w:bottom w:val="single" w:color="D9D3D7" w:sz="4"/>
+              <w:right w:val="single" w:color="D9D3D7" w:sz="4"/>
+            </w:tcBorders>
+            <w:tcMar>
+              <w:top w:type="dxa" w:w="70"/>
+              <w:left w:type="dxa" w:w="100"/>
+              <w:bottom w:type="dxa" w:w="70"/>
+              <w:right w:type="dxa" w:w="100"/>
+            </w:tcMar>
+          </w:tcPr>
+          <w:p>
+            <w:pPr>
+              <w:jc w:val="right"/>
+            </w:pPr>
+            <w:r>
+              <w:rPr>
+                <w:rFonts w:ascii="Aptos" w:cs="Aptos" w:eastAsia="Aptos" w:hAnsi="Aptos"/>
+                <w:b w:val="false"/>
+                <w:bCs w:val="false"/>
+                <w:color w:val="2F282D"/>
+                <w:sz w:val="18"/>
+                <w:szCs w:val="18"/>
+              </w:rPr>
+              <w:t xml:space="preserve">880</w:t>
+            </w:r>
+          </w:p>
+        </w:tc>
+        <w:tc>
+          <w:tcPr>
+            <w:tcW w:type="dxa" w:w="500"/>
+            <w:tcBorders>
+              <w:top w:val="single" w:color="D9D3D7" w:sz="4"/>
+              <w:left w:val="single" w:color="D9D3D7" w:sz="4"/>
+              <w:bottom w:val="single" w:color="D9D3D7" w:sz="4"/>
+              <w:right w:val="single" w:color="D9D3D7" w:sz="4"/>
+            </w:tcBorders>
+            <w:tcMar>
+              <w:top w:type="dxa" w:w="70"/>
+              <w:left w:type="dxa" w:w="100"/>
+              <w:bottom w:type="dxa" w:w="70"/>
+              <w:right w:type="dxa" w:w="100"/>
+            </w:tcMar>
+          </w:tcPr>
+          <w:p>
+            <w:pPr>
+              <w:jc w:val="right"/>
+            </w:pPr>
+            <w:r>
+              <w:rPr>
+                <w:rFonts w:ascii="Aptos" w:cs="Aptos" w:eastAsia="Aptos" w:hAnsi="Aptos"/>
+                <w:b w:val="false"/>
+                <w:bCs w:val="false"/>
+                <w:color w:val="2F282D"/>
+                <w:sz w:val="18"/>
+                <w:szCs w:val="18"/>
+              </w:rPr>
+              <w:t xml:space="preserve">32</w:t>
+            </w:r>
+          </w:p>
+        </w:tc>
+        <w:tc>
+          <w:tcPr>
+            <w:tcW w:type="dxa" w:w="800"/>
+            <w:tcBorders>
+              <w:top w:val="single" w:color="D9D3D7" w:sz="4"/>
+              <w:left w:val="single" w:color="D9D3D7" w:sz="4"/>
+              <w:bottom w:val="single" w:color="D9D3D7" w:sz="4"/>
+              <w:right w:val="single" w:color="D9D3D7" w:sz="4"/>
+            </w:tcBorders>
+            <w:tcMar>
+              <w:top w:type="dxa" w:w="70"/>
+              <w:left w:type="dxa" w:w="100"/>
+              <w:bottom w:type="dxa" w:w="70"/>
+              <w:right w:type="dxa" w:w="100"/>
+            </w:tcMar>
+          </w:tcPr>
+          <w:p>
+            <w:pPr>
+              <w:jc w:val="right"/>
+            </w:pPr>
+            <w:r>
+              <w:rPr>
+                <w:rFonts w:ascii="Aptos" w:cs="Aptos" w:eastAsia="Aptos" w:hAnsi="Aptos"/>
+                <w:b w:val="false"/>
+                <w:bCs w:val="false"/>
+                <w:color w:val="2F282D"/>
+                <w:sz w:val="18"/>
+                <w:szCs w:val="18"/>
+              </w:rPr>
+              <w:t xml:space="preserve">45.22</w:t>
+            </w:r>
+          </w:p>
+        </w:tc>
+        <w:tc>
+          <w:tcPr>
+            <w:tcW w:type="dxa" w:w="3260"/>
+            <w:tcBorders>
+              <w:top w:val="single" w:color="D9D3D7" w:sz="4"/>
+              <w:left w:val="single" w:color="D9D3D7" w:sz="4"/>
+              <w:bottom w:val="single" w:color="D9D3D7" w:sz="4"/>
+              <w:right w:val="single" w:color="D9D3D7" w:sz="4"/>
+            </w:tcBorders>
+            <w:tcMar>
+              <w:top w:type="dxa" w:w="70"/>
+              <w:left w:type="dxa" w:w="100"/>
+              <w:bottom w:type="dxa" w:w="70"/>
+              <w:right w:type="dxa" w:w="100"/>
+            </w:tcMar>
+          </w:tcPr>
+          <w:p>
+            <w:pPr>
+              <w:jc w:val="left"/>
+            </w:pPr>
+            <w:r>
+              <w:rPr>
+                <w:rFonts w:ascii="Aptos" w:cs="Aptos" w:eastAsia="Aptos" w:hAnsi="Aptos"/>
+                <w:b w:val="false"/>
+                <w:bCs w:val="false"/>
+                <w:color w:val="2F282D"/>
+                <w:sz w:val="18"/>
+                <w:szCs w:val="18"/>
+              </w:rPr>
+              <w:t xml:space="preserve">Slightly above the KD 30 ceiling; kept because multilingual delivery is confirmed</w:t>
+            </w:r>
+          </w:p>
+        </w:tc>
+      </w:tr>
+      <w:tr>
+        <w:trPr>
+          <w:cantSplit/>
+        </w:trPr>
+        <w:tc>
+          <w:tcPr>
+            <w:tcW w:type="dxa" w:w="2700"/>
+            <w:tcBorders>
+              <w:top w:val="single" w:color="D9D3D7" w:sz="4"/>
+              <w:left w:val="single" w:color="D9D3D7" w:sz="4"/>
+              <w:bottom w:val="single" w:color="D9D3D7" w:sz="4"/>
+              <w:right w:val="single" w:color="D9D3D7" w:sz="4"/>
+            </w:tcBorders>
+            <w:shd w:fill="F7F4F6" w:color="auto" w:val="clear"/>
+            <w:tcMar>
+              <w:top w:type="dxa" w:w="70"/>
+              <w:left w:type="dxa" w:w="100"/>
+              <w:bottom w:type="dxa" w:w="70"/>
+              <w:right w:type="dxa" w:w="100"/>
+            </w:tcMar>
+          </w:tcPr>
+          <w:p>
+            <w:pPr>
+              <w:jc w:val="left"/>
+            </w:pPr>
+            <w:r>
+              <w:rPr>
+                <w:rFonts w:ascii="Aptos" w:cs="Aptos" w:eastAsia="Aptos" w:hAnsi="Aptos"/>
+                <w:b/>
+                <w:bCs/>
+                <w:color w:val="2F282D"/>
+                <w:sz w:val="18"/>
+                <w:szCs w:val="18"/>
+              </w:rPr>
+              <w:t xml:space="preserve">multilingual call center</w:t>
+            </w:r>
+          </w:p>
+        </w:tc>
+        <w:tc>
+          <w:tcPr>
+            <w:tcW w:type="dxa" w:w="1300"/>
+            <w:tcBorders>
+              <w:top w:val="single" w:color="D9D3D7" w:sz="4"/>
+              <w:left w:val="single" w:color="D9D3D7" w:sz="4"/>
+              <w:bottom w:val="single" w:color="D9D3D7" w:sz="4"/>
+              <w:right w:val="single" w:color="D9D3D7" w:sz="4"/>
+            </w:tcBorders>
+            <w:shd w:fill="F7F4F6" w:color="auto" w:val="clear"/>
+            <w:tcMar>
+              <w:top w:type="dxa" w:w="70"/>
+              <w:left w:type="dxa" w:w="100"/>
+              <w:bottom w:type="dxa" w:w="70"/>
+              <w:right w:type="dxa" w:w="100"/>
+            </w:tcMar>
+          </w:tcPr>
+          <w:p>
+            <w:pPr>
+              <w:jc w:val="left"/>
+            </w:pPr>
+            <w:r>
+              <w:rPr>
+                <w:rFonts w:ascii="Aptos" w:cs="Aptos" w:eastAsia="Aptos" w:hAnsi="Aptos"/>
+                <w:b w:val="false"/>
+                <w:bCs w:val="false"/>
+                <w:color w:val="2F282D"/>
+                <w:sz w:val="18"/>
+                <w:szCs w:val="18"/>
+              </w:rPr>
+              <w:t xml:space="preserve">Secondary</w:t>
+            </w:r>
+          </w:p>
+        </w:tc>
+        <w:tc>
+          <w:tcPr>
+            <w:tcW w:type="dxa" w:w="800"/>
+            <w:tcBorders>
+              <w:top w:val="single" w:color="D9D3D7" w:sz="4"/>
+              <w:left w:val="single" w:color="D9D3D7" w:sz="4"/>
+              <w:bottom w:val="single" w:color="D9D3D7" w:sz="4"/>
+              <w:right w:val="single" w:color="D9D3D7" w:sz="4"/>
+            </w:tcBorders>
+            <w:shd w:fill="F7F4F6" w:color="auto" w:val="clear"/>
+            <w:tcMar>
+              <w:top w:type="dxa" w:w="70"/>
+              <w:left w:type="dxa" w:w="100"/>
+              <w:bottom w:type="dxa" w:w="70"/>
+              <w:right w:type="dxa" w:w="100"/>
+            </w:tcMar>
+          </w:tcPr>
+          <w:p>
+            <w:pPr>
+              <w:jc w:val="right"/>
+            </w:pPr>
+            <w:r>
+              <w:rPr>
+                <w:rFonts w:ascii="Aptos" w:cs="Aptos" w:eastAsia="Aptos" w:hAnsi="Aptos"/>
+                <w:b w:val="false"/>
+                <w:bCs w:val="false"/>
+                <w:color w:val="2F282D"/>
+                <w:sz w:val="18"/>
+                <w:szCs w:val="18"/>
+              </w:rPr>
+              <w:t xml:space="preserve">320</w:t>
+            </w:r>
+          </w:p>
+        </w:tc>
+        <w:tc>
+          <w:tcPr>
+            <w:tcW w:type="dxa" w:w="500"/>
+            <w:tcBorders>
+              <w:top w:val="single" w:color="D9D3D7" w:sz="4"/>
+              <w:left w:val="single" w:color="D9D3D7" w:sz="4"/>
+              <w:bottom w:val="single" w:color="D9D3D7" w:sz="4"/>
+              <w:right w:val="single" w:color="D9D3D7" w:sz="4"/>
+            </w:tcBorders>
+            <w:shd w:fill="F7F4F6" w:color="auto" w:val="clear"/>
+            <w:tcMar>
+              <w:top w:type="dxa" w:w="70"/>
+              <w:left w:type="dxa" w:w="100"/>
+              <w:bottom w:type="dxa" w:w="70"/>
+              <w:right w:type="dxa" w:w="100"/>
+            </w:tcMar>
+          </w:tcPr>
+          <w:p>
+            <w:pPr>
+              <w:jc w:val="right"/>
+            </w:pPr>
+            <w:r>
+              <w:rPr>
+                <w:rFonts w:ascii="Aptos" w:cs="Aptos" w:eastAsia="Aptos" w:hAnsi="Aptos"/>
+                <w:b w:val="false"/>
+                <w:bCs w:val="false"/>
+                <w:color w:val="2F282D"/>
+                <w:sz w:val="18"/>
+                <w:szCs w:val="18"/>
+              </w:rPr>
+              <w:t xml:space="preserve">19</w:t>
+            </w:r>
+          </w:p>
+        </w:tc>
+        <w:tc>
+          <w:tcPr>
+            <w:tcW w:type="dxa" w:w="800"/>
+            <w:tcBorders>
+              <w:top w:val="single" w:color="D9D3D7" w:sz="4"/>
+              <w:left w:val="single" w:color="D9D3D7" w:sz="4"/>
+              <w:bottom w:val="single" w:color="D9D3D7" w:sz="4"/>
+              <w:right w:val="single" w:color="D9D3D7" w:sz="4"/>
+            </w:tcBorders>
+            <w:shd w:fill="F7F4F6" w:color="auto" w:val="clear"/>
+            <w:tcMar>
+              <w:top w:type="dxa" w:w="70"/>
+              <w:left w:type="dxa" w:w="100"/>
+              <w:bottom w:type="dxa" w:w="70"/>
+              <w:right w:type="dxa" w:w="100"/>
+            </w:tcMar>
+          </w:tcPr>
+          <w:p>
+            <w:pPr>
+              <w:jc w:val="right"/>
+            </w:pPr>
+            <w:r>
+              <w:rPr>
+                <w:rFonts w:ascii="Aptos" w:cs="Aptos" w:eastAsia="Aptos" w:hAnsi="Aptos"/>
+                <w:b w:val="false"/>
+                <w:bCs w:val="false"/>
+                <w:color w:val="2F282D"/>
+                <w:sz w:val="18"/>
+                <w:szCs w:val="18"/>
+              </w:rPr>
+              <w:t xml:space="preserve">–</w:t>
+            </w:r>
+          </w:p>
+        </w:tc>
+        <w:tc>
+          <w:tcPr>
+            <w:tcW w:type="dxa" w:w="3260"/>
+            <w:tcBorders>
+              <w:top w:val="single" w:color="D9D3D7" w:sz="4"/>
+              <w:left w:val="single" w:color="D9D3D7" w:sz="4"/>
+              <w:bottom w:val="single" w:color="D9D3D7" w:sz="4"/>
+              <w:right w:val="single" w:color="D9D3D7" w:sz="4"/>
+            </w:tcBorders>
+            <w:shd w:fill="F7F4F6" w:color="auto" w:val="clear"/>
+            <w:tcMar>
+              <w:top w:type="dxa" w:w="70"/>
+              <w:left w:type="dxa" w:w="100"/>
+              <w:bottom w:type="dxa" w:w="70"/>
+              <w:right w:type="dxa" w:w="100"/>
+            </w:tcMar>
+          </w:tcPr>
+          <w:p>
+            <w:pPr>
+              <w:jc w:val="left"/>
+            </w:pPr>
+            <w:r>
+              <w:rPr>
+                <w:rFonts w:ascii="Aptos" w:cs="Aptos" w:eastAsia="Aptos" w:hAnsi="Aptos"/>
+                <w:b w:val="false"/>
+                <w:bCs w:val="false"/>
+                <w:color w:val="2F282D"/>
+                <w:sz w:val="18"/>
+                <w:szCs w:val="18"/>
+              </w:rPr>
+              <w:t xml:space="preserve">Easy; no specific languages named on the page</w:t>
+            </w:r>
+          </w:p>
+        </w:tc>
+      </w:tr>
+      <w:tr>
+        <w:trPr>
+          <w:cantSplit/>
+        </w:trPr>
+        <w:tc>
+          <w:tcPr>
+            <w:tcW w:type="dxa" w:w="2700"/>
+            <w:tcBorders>
+              <w:top w:val="single" w:color="D9D3D7" w:sz="4"/>
+              <w:left w:val="single" w:color="D9D3D7" w:sz="4"/>
+              <w:bottom w:val="single" w:color="D9D3D7" w:sz="4"/>
+              <w:right w:val="single" w:color="D9D3D7" w:sz="4"/>
+            </w:tcBorders>
+            <w:tcMar>
+              <w:top w:type="dxa" w:w="70"/>
+              <w:left w:type="dxa" w:w="100"/>
+              <w:bottom w:type="dxa" w:w="70"/>
+              <w:right w:type="dxa" w:w="100"/>
+            </w:tcMar>
+          </w:tcPr>
+          <w:p>
+            <w:pPr>
+              <w:jc w:val="left"/>
+            </w:pPr>
+            <w:r>
+              <w:rPr>
+                <w:rFonts w:ascii="Aptos" w:cs="Aptos" w:eastAsia="Aptos" w:hAnsi="Aptos"/>
+                <w:b/>
+                <w:bCs/>
+                <w:color w:val="2F282D"/>
+                <w:sz w:val="18"/>
+                <w:szCs w:val="18"/>
+              </w:rPr>
+              <w:t xml:space="preserve">multilingual customer service</w:t>
+            </w:r>
+          </w:p>
+        </w:tc>
+        <w:tc>
+          <w:tcPr>
+            <w:tcW w:type="dxa" w:w="1300"/>
+            <w:tcBorders>
+              <w:top w:val="single" w:color="D9D3D7" w:sz="4"/>
+              <w:left w:val="single" w:color="D9D3D7" w:sz="4"/>
+              <w:bottom w:val="single" w:color="D9D3D7" w:sz="4"/>
+              <w:right w:val="single" w:color="D9D3D7" w:sz="4"/>
+            </w:tcBorders>
+            <w:tcMar>
+              <w:top w:type="dxa" w:w="70"/>
+              <w:left w:type="dxa" w:w="100"/>
+              <w:bottom w:type="dxa" w:w="70"/>
+              <w:right w:type="dxa" w:w="100"/>
+            </w:tcMar>
+          </w:tcPr>
+          <w:p>
+            <w:pPr>
+              <w:jc w:val="left"/>
+            </w:pPr>
+            <w:r>
+              <w:rPr>
+                <w:rFonts w:ascii="Aptos" w:cs="Aptos" w:eastAsia="Aptos" w:hAnsi="Aptos"/>
+                <w:b w:val="false"/>
+                <w:bCs w:val="false"/>
+                <w:color w:val="2F282D"/>
+                <w:sz w:val="18"/>
+                <w:szCs w:val="18"/>
+              </w:rPr>
+              <w:t xml:space="preserve">Secondary</w:t>
+            </w:r>
+          </w:p>
+        </w:tc>
+        <w:tc>
+          <w:tcPr>
+            <w:tcW w:type="dxa" w:w="800"/>
+            <w:tcBorders>
+              <w:top w:val="single" w:color="D9D3D7" w:sz="4"/>
+              <w:left w:val="single" w:color="D9D3D7" w:sz="4"/>
+              <w:bottom w:val="single" w:color="D9D3D7" w:sz="4"/>
+              <w:right w:val="single" w:color="D9D3D7" w:sz="4"/>
+            </w:tcBorders>
+            <w:tcMar>
+              <w:top w:type="dxa" w:w="70"/>
+              <w:left w:type="dxa" w:w="100"/>
+              <w:bottom w:type="dxa" w:w="70"/>
+              <w:right w:type="dxa" w:w="100"/>
+            </w:tcMar>
+          </w:tcPr>
+          <w:p>
+            <w:pPr>
+              <w:jc w:val="right"/>
+            </w:pPr>
+            <w:r>
+              <w:rPr>
+                <w:rFonts w:ascii="Aptos" w:cs="Aptos" w:eastAsia="Aptos" w:hAnsi="Aptos"/>
+                <w:b w:val="false"/>
+                <w:bCs w:val="false"/>
+                <w:color w:val="2F282D"/>
+                <w:sz w:val="18"/>
+                <w:szCs w:val="18"/>
+              </w:rPr>
+              <w:t xml:space="preserve">320</w:t>
+            </w:r>
+          </w:p>
+        </w:tc>
+        <w:tc>
+          <w:tcPr>
+            <w:tcW w:type="dxa" w:w="500"/>
+            <w:tcBorders>
+              <w:top w:val="single" w:color="D9D3D7" w:sz="4"/>
+              <w:left w:val="single" w:color="D9D3D7" w:sz="4"/>
+              <w:bottom w:val="single" w:color="D9D3D7" w:sz="4"/>
+              <w:right w:val="single" w:color="D9D3D7" w:sz="4"/>
+            </w:tcBorders>
+            <w:tcMar>
+              <w:top w:type="dxa" w:w="70"/>
+              <w:left w:type="dxa" w:w="100"/>
+              <w:bottom w:type="dxa" w:w="70"/>
+              <w:right w:type="dxa" w:w="100"/>
+            </w:tcMar>
+          </w:tcPr>
+          <w:p>
+            <w:pPr>
+              <w:jc w:val="right"/>
+            </w:pPr>
+            <w:r>
+              <w:rPr>
+                <w:rFonts w:ascii="Aptos" w:cs="Aptos" w:eastAsia="Aptos" w:hAnsi="Aptos"/>
+                <w:b w:val="false"/>
+                <w:bCs w:val="false"/>
+                <w:color w:val="2F282D"/>
+                <w:sz w:val="18"/>
+                <w:szCs w:val="18"/>
+              </w:rPr>
+              <w:t xml:space="preserve">28</w:t>
+            </w:r>
+          </w:p>
+        </w:tc>
+        <w:tc>
+          <w:tcPr>
+            <w:tcW w:type="dxa" w:w="800"/>
+            <w:tcBorders>
+              <w:top w:val="single" w:color="D9D3D7" w:sz="4"/>
+              <w:left w:val="single" w:color="D9D3D7" w:sz="4"/>
+              <w:bottom w:val="single" w:color="D9D3D7" w:sz="4"/>
+              <w:right w:val="single" w:color="D9D3D7" w:sz="4"/>
+            </w:tcBorders>
+            <w:tcMar>
+              <w:top w:type="dxa" w:w="70"/>
+              <w:left w:type="dxa" w:w="100"/>
+              <w:bottom w:type="dxa" w:w="70"/>
+              <w:right w:type="dxa" w:w="100"/>
+            </w:tcMar>
+          </w:tcPr>
+          <w:p>
+            <w:pPr>
+              <w:jc w:val="right"/>
+            </w:pPr>
+            <w:r>
+              <w:rPr>
+                <w:rFonts w:ascii="Aptos" w:cs="Aptos" w:eastAsia="Aptos" w:hAnsi="Aptos"/>
+                <w:b w:val="false"/>
+                <w:bCs w:val="false"/>
+                <w:color w:val="2F282D"/>
+                <w:sz w:val="18"/>
+                <w:szCs w:val="18"/>
+              </w:rPr>
+              <w:t xml:space="preserve">–</w:t>
+            </w:r>
+          </w:p>
+        </w:tc>
+        <w:tc>
+          <w:tcPr>
+            <w:tcW w:type="dxa" w:w="3260"/>
+            <w:tcBorders>
+              <w:top w:val="single" w:color="D9D3D7" w:sz="4"/>
+              <w:left w:val="single" w:color="D9D3D7" w:sz="4"/>
+              <w:bottom w:val="single" w:color="D9D3D7" w:sz="4"/>
+              <w:right w:val="single" w:color="D9D3D7" w:sz="4"/>
+            </w:tcBorders>
+            <w:tcMar>
+              <w:top w:type="dxa" w:w="70"/>
+              <w:left w:type="dxa" w:w="100"/>
+              <w:bottom w:type="dxa" w:w="70"/>
+              <w:right w:type="dxa" w:w="100"/>
+            </w:tcMar>
+          </w:tcPr>
+          <w:p>
+            <w:pPr>
+              <w:jc w:val="left"/>
+            </w:pPr>
+            <w:r>
+              <w:rPr>
+                <w:rFonts w:ascii="Aptos" w:cs="Aptos" w:eastAsia="Aptos" w:hAnsi="Aptos"/>
+                <w:b w:val="false"/>
+                <w:bCs w:val="false"/>
+                <w:color w:val="2F282D"/>
+                <w:sz w:val="18"/>
+                <w:szCs w:val="18"/>
+              </w:rPr>
+              <w:t xml:space="preserve">Variant of multilingual customer support</w:t>
+            </w:r>
+          </w:p>
+        </w:tc>
+      </w:tr>
+      <w:tr>
+        <w:trPr>
+          <w:cantSplit/>
+        </w:trPr>
+        <w:tc>
+          <w:tcPr>
+            <w:tcW w:type="dxa" w:w="2700"/>
+            <w:tcBorders>
+              <w:top w:val="single" w:color="D9D3D7" w:sz="4"/>
+              <w:left w:val="single" w:color="D9D3D7" w:sz="4"/>
+              <w:bottom w:val="single" w:color="D9D3D7" w:sz="4"/>
+              <w:right w:val="single" w:color="D9D3D7" w:sz="4"/>
+            </w:tcBorders>
+            <w:shd w:fill="F7F4F6" w:color="auto" w:val="clear"/>
+            <w:tcMar>
+              <w:top w:type="dxa" w:w="70"/>
+              <w:left w:type="dxa" w:w="100"/>
+              <w:bottom w:type="dxa" w:w="70"/>
+              <w:right w:type="dxa" w:w="100"/>
+            </w:tcMar>
+          </w:tcPr>
+          <w:p>
+            <w:pPr>
+              <w:jc w:val="left"/>
+            </w:pPr>
+            <w:r>
+              <w:rPr>
+                <w:rFonts w:ascii="Aptos" w:cs="Aptos" w:eastAsia="Aptos" w:hAnsi="Aptos"/>
+                <w:b/>
+                <w:bCs/>
+                <w:color w:val="2F282D"/>
+                <w:sz w:val="18"/>
+                <w:szCs w:val="18"/>
+              </w:rPr>
+              <w:t xml:space="preserve">hipaa compliant call center</w:t>
+            </w:r>
+          </w:p>
+        </w:tc>
+        <w:tc>
+          <w:tcPr>
+            <w:tcW w:type="dxa" w:w="1300"/>
+            <w:tcBorders>
+              <w:top w:val="single" w:color="D9D3D7" w:sz="4"/>
+              <w:left w:val="single" w:color="D9D3D7" w:sz="4"/>
+              <w:bottom w:val="single" w:color="D9D3D7" w:sz="4"/>
+              <w:right w:val="single" w:color="D9D3D7" w:sz="4"/>
+            </w:tcBorders>
+            <w:shd w:fill="F7F4F6" w:color="auto" w:val="clear"/>
+            <w:tcMar>
+              <w:top w:type="dxa" w:w="70"/>
+              <w:left w:type="dxa" w:w="100"/>
+              <w:bottom w:type="dxa" w:w="70"/>
+              <w:right w:type="dxa" w:w="100"/>
+            </w:tcMar>
+          </w:tcPr>
+          <w:p>
+            <w:pPr>
+              <w:jc w:val="left"/>
+            </w:pPr>
+            <w:r>
+              <w:rPr>
+                <w:rFonts w:ascii="Aptos" w:cs="Aptos" w:eastAsia="Aptos" w:hAnsi="Aptos"/>
+                <w:b w:val="false"/>
+                <w:bCs w:val="false"/>
+                <w:color w:val="2F282D"/>
+                <w:sz w:val="18"/>
+                <w:szCs w:val="18"/>
+              </w:rPr>
+              <w:t xml:space="preserve">Secondary</w:t>
+            </w:r>
+          </w:p>
+        </w:tc>
+        <w:tc>
+          <w:tcPr>
+            <w:tcW w:type="dxa" w:w="800"/>
+            <w:tcBorders>
+              <w:top w:val="single" w:color="D9D3D7" w:sz="4"/>
+              <w:left w:val="single" w:color="D9D3D7" w:sz="4"/>
+              <w:bottom w:val="single" w:color="D9D3D7" w:sz="4"/>
+              <w:right w:val="single" w:color="D9D3D7" w:sz="4"/>
+            </w:tcBorders>
+            <w:shd w:fill="F7F4F6" w:color="auto" w:val="clear"/>
+            <w:tcMar>
+              <w:top w:type="dxa" w:w="70"/>
+              <w:left w:type="dxa" w:w="100"/>
+              <w:bottom w:type="dxa" w:w="70"/>
+              <w:right w:type="dxa" w:w="100"/>
+            </w:tcMar>
+          </w:tcPr>
+          <w:p>
+            <w:pPr>
+              <w:jc w:val="right"/>
+            </w:pPr>
+            <w:r>
+              <w:rPr>
+                <w:rFonts w:ascii="Aptos" w:cs="Aptos" w:eastAsia="Aptos" w:hAnsi="Aptos"/>
+                <w:b w:val="false"/>
+                <w:bCs w:val="false"/>
+                <w:color w:val="2F282D"/>
+                <w:sz w:val="18"/>
+                <w:szCs w:val="18"/>
+              </w:rPr>
+              <w:t xml:space="preserve">210</w:t>
+            </w:r>
+          </w:p>
+        </w:tc>
+        <w:tc>
+          <w:tcPr>
+            <w:tcW w:type="dxa" w:w="500"/>
+            <w:tcBorders>
+              <w:top w:val="single" w:color="D9D3D7" w:sz="4"/>
+              <w:left w:val="single" w:color="D9D3D7" w:sz="4"/>
+              <w:bottom w:val="single" w:color="D9D3D7" w:sz="4"/>
+              <w:right w:val="single" w:color="D9D3D7" w:sz="4"/>
+            </w:tcBorders>
+            <w:shd w:fill="F7F4F6" w:color="auto" w:val="clear"/>
+            <w:tcMar>
+              <w:top w:type="dxa" w:w="70"/>
+              <w:left w:type="dxa" w:w="100"/>
+              <w:bottom w:type="dxa" w:w="70"/>
+              <w:right w:type="dxa" w:w="100"/>
+            </w:tcMar>
+          </w:tcPr>
+          <w:p>
+            <w:pPr>
+              <w:jc w:val="right"/>
+            </w:pPr>
+            <w:r>
+              <w:rPr>
+                <w:rFonts w:ascii="Aptos" w:cs="Aptos" w:eastAsia="Aptos" w:hAnsi="Aptos"/>
+                <w:b w:val="false"/>
+                <w:bCs w:val="false"/>
+                <w:color w:val="2F282D"/>
+                <w:sz w:val="18"/>
+                <w:szCs w:val="18"/>
+              </w:rPr>
+              <w:t xml:space="preserve">8</w:t>
+            </w:r>
+          </w:p>
+        </w:tc>
+        <w:tc>
+          <w:tcPr>
+            <w:tcW w:type="dxa" w:w="800"/>
+            <w:tcBorders>
+              <w:top w:val="single" w:color="D9D3D7" w:sz="4"/>
+              <w:left w:val="single" w:color="D9D3D7" w:sz="4"/>
+              <w:bottom w:val="single" w:color="D9D3D7" w:sz="4"/>
+              <w:right w:val="single" w:color="D9D3D7" w:sz="4"/>
+            </w:tcBorders>
+            <w:shd w:fill="F7F4F6" w:color="auto" w:val="clear"/>
+            <w:tcMar>
+              <w:top w:type="dxa" w:w="70"/>
+              <w:left w:type="dxa" w:w="100"/>
+              <w:bottom w:type="dxa" w:w="70"/>
+              <w:right w:type="dxa" w:w="100"/>
+            </w:tcMar>
+          </w:tcPr>
+          <w:p>
+            <w:pPr>
+              <w:jc w:val="right"/>
+            </w:pPr>
+            <w:r>
+              <w:rPr>
+                <w:rFonts w:ascii="Aptos" w:cs="Aptos" w:eastAsia="Aptos" w:hAnsi="Aptos"/>
+                <w:b w:val="false"/>
+                <w:bCs w:val="false"/>
+                <w:color w:val="2F282D"/>
+                <w:sz w:val="18"/>
+                <w:szCs w:val="18"/>
+              </w:rPr>
+              <w:t xml:space="preserve">62.69</w:t>
+            </w:r>
+          </w:p>
+        </w:tc>
+        <w:tc>
+          <w:tcPr>
+            <w:tcW w:type="dxa" w:w="3260"/>
+            <w:tcBorders>
+              <w:top w:val="single" w:color="D9D3D7" w:sz="4"/>
+              <w:left w:val="single" w:color="D9D3D7" w:sz="4"/>
+              <w:bottom w:val="single" w:color="D9D3D7" w:sz="4"/>
+              <w:right w:val="single" w:color="D9D3D7" w:sz="4"/>
+            </w:tcBorders>
+            <w:shd w:fill="F7F4F6" w:color="auto" w:val="clear"/>
+            <w:tcMar>
+              <w:top w:type="dxa" w:w="70"/>
+              <w:left w:type="dxa" w:w="100"/>
+              <w:bottom w:type="dxa" w:w="70"/>
+              <w:right w:type="dxa" w:w="100"/>
+            </w:tcMar>
+          </w:tcPr>
+          <w:p>
+            <w:pPr>
+              <w:jc w:val="left"/>
+            </w:pPr>
+            <w:r>
+              <w:rPr>
+                <w:rFonts w:ascii="Aptos" w:cs="Aptos" w:eastAsia="Aptos" w:hAnsi="Aptos"/>
+                <w:b w:val="false"/>
+                <w:bCs w:val="false"/>
+                <w:color w:val="2F282D"/>
+                <w:sz w:val="18"/>
+                <w:szCs w:val="18"/>
+              </w:rPr>
+              <w:t xml:space="preserve">Very easy; backed by HIPAA training and ISO/IEC 27001:2022 on the compliance page</w:t>
+            </w:r>
+          </w:p>
+        </w:tc>
+      </w:tr>
     </w:tbl>
     <w:p>
       <w:pPr>
@@ -14178,7 +15623,7 @@
                 <w:sz w:val="18"/>
                 <w:szCs w:val="18"/>
               </w:rPr>
-              <w:t xml:space="preserve">customer support outsourcing services, outsourced technical support, help desk outsourcing, contact center consulting, contact center analytics, voice of customer analytics, contact center automation, customer experience consulting, CX transformation</w:t>
+              <w:t xml:space="preserve">customer support outsourcing services, outsourced technical support, IT help desk outsourcing (contains help desk outsourcing), contact center consulting, contact center analytics, voice of customer analytics, contact center automation, customer experience consulting, CX transformation</w:t>
             </w:r>
           </w:p>
         </w:tc>
@@ -14395,7 +15840,7 @@
                 <w:sz w:val="18"/>
                 <w:szCs w:val="18"/>
               </w:rPr>
-              <w:t xml:space="preserve">customer experience outsourcing, tech support outsourcing, SaaS customer support outsourcing, 24/7 support</w:t>
+              <w:t xml:space="preserve">customer experience outsourcing, tech support outsourcing, SaaS customer support outsourcing, 24/7 support, IT help desk outsourcing, service desk outsourcing, outsourced IT help desk, multilingual customer support, multilingual customer service, multilingual call center, HIPAA compliant call center</w:t>
             </w:r>
           </w:p>
         </w:tc>
@@ -14433,6 +15878,78 @@
                 <w:sz w:val="18"/>
                 <w:szCs w:val="18"/>
               </w:rPr>
+              <w:t xml:space="preserve">Hero, main answer, model and why cards</w:t>
+            </w:r>
+          </w:p>
+        </w:tc>
+        <w:tc>
+          <w:tcPr>
+            <w:tcW w:type="dxa" w:w="6560"/>
+            <w:tcBorders>
+              <w:top w:val="single" w:color="D9D3D7" w:sz="4"/>
+              <w:left w:val="single" w:color="D9D3D7" w:sz="4"/>
+              <w:bottom w:val="single" w:color="D9D3D7" w:sz="4"/>
+              <w:right w:val="single" w:color="D9D3D7" w:sz="4"/>
+            </w:tcBorders>
+            <w:tcMar>
+              <w:top w:type="dxa" w:w="70"/>
+              <w:left w:type="dxa" w:w="100"/>
+              <w:bottom w:type="dxa" w:w="70"/>
+              <w:right w:type="dxa" w:w="100"/>
+            </w:tcMar>
+          </w:tcPr>
+          <w:p>
+            <w:pPr>
+              <w:jc w:val="left"/>
+            </w:pPr>
+            <w:r>
+              <w:rPr>
+                <w:rFonts w:ascii="Aptos" w:cs="Aptos" w:eastAsia="Aptos" w:hAnsi="Aptos"/>
+                <w:b w:val="false"/>
+                <w:bCs w:val="false"/>
+                <w:color w:val="2F282D"/>
+                <w:sz w:val="18"/>
+                <w:szCs w:val="18"/>
+              </w:rPr>
+              <w:t xml:space="preserve">multilingual (no specific languages named), ISO/IEC 27001:2022, IT help desk</w:t>
+            </w:r>
+          </w:p>
+        </w:tc>
+      </w:tr>
+      <w:tr>
+        <w:trPr>
+          <w:cantSplit/>
+        </w:trPr>
+        <w:tc>
+          <w:tcPr>
+            <w:tcW w:type="dxa" w:w="2800"/>
+            <w:tcBorders>
+              <w:top w:val="single" w:color="D9D3D7" w:sz="4"/>
+              <w:left w:val="single" w:color="D9D3D7" w:sz="4"/>
+              <w:bottom w:val="single" w:color="D9D3D7" w:sz="4"/>
+              <w:right w:val="single" w:color="D9D3D7" w:sz="4"/>
+            </w:tcBorders>
+            <w:shd w:fill="F7F4F6" w:color="auto" w:val="clear"/>
+            <w:tcMar>
+              <w:top w:type="dxa" w:w="70"/>
+              <w:left w:type="dxa" w:w="100"/>
+              <w:bottom w:type="dxa" w:w="70"/>
+              <w:right w:type="dxa" w:w="100"/>
+            </w:tcMar>
+          </w:tcPr>
+          <w:p>
+            <w:pPr>
+              <w:jc w:val="left"/>
+            </w:pPr>
+            <w:r>
+              <w:rPr>
+                <w:rFonts w:ascii="Aptos" w:cs="Aptos" w:eastAsia="Aptos" w:hAnsi="Aptos"/>
+                <w:b/>
+                <w:bCs/>
+                <w:color w:val="2F282D"/>
+                <w:sz w:val="18"/>
+                <w:szCs w:val="18"/>
+              </w:rPr>
               <w:t xml:space="preserve">JSON-LD</w:t>
             </w:r>
           </w:p>
@@ -14446,27 +15963,28 @@
               <w:bottom w:val="single" w:color="D9D3D7" w:sz="4"/>
               <w:right w:val="single" w:color="D9D3D7" w:sz="4"/>
             </w:tcBorders>
-            <w:tcMar>
-              <w:top w:type="dxa" w:w="70"/>
-              <w:left w:type="dxa" w:w="100"/>
-              <w:bottom w:type="dxa" w:w="70"/>
-              <w:right w:type="dxa" w:w="100"/>
-            </w:tcMar>
-          </w:tcPr>
-          <w:p>
-            <w:pPr>
-              <w:jc w:val="left"/>
-            </w:pPr>
-            <w:r>
-              <w:rPr>
-                <w:rFonts w:ascii="Aptos" w:cs="Aptos" w:eastAsia="Aptos" w:hAnsi="Aptos"/>
-                <w:b w:val="false"/>
-                <w:bCs w:val="false"/>
-                <w:color w:val="2F282D"/>
-                <w:sz w:val="18"/>
-                <w:szCs w:val="18"/>
-              </w:rPr>
-              <w:t xml:space="preserve">alternateName: Customer Support Outsourcing, Technical Support Outsourcing, Outsourced Technical Support, Help Desk Outsourcing, Contact Center Consulting, Customer Experience Consulting, Nearshore Contact Center; hoursAvailable 24/7</w:t>
+            <w:shd w:fill="F7F4F6" w:color="auto" w:val="clear"/>
+            <w:tcMar>
+              <w:top w:type="dxa" w:w="70"/>
+              <w:left w:type="dxa" w:w="100"/>
+              <w:bottom w:type="dxa" w:w="70"/>
+              <w:right w:type="dxa" w:w="100"/>
+            </w:tcMar>
+          </w:tcPr>
+          <w:p>
+            <w:pPr>
+              <w:jc w:val="left"/>
+            </w:pPr>
+            <w:r>
+              <w:rPr>
+                <w:rFonts w:ascii="Aptos" w:cs="Aptos" w:eastAsia="Aptos" w:hAnsi="Aptos"/>
+                <w:b w:val="false"/>
+                <w:bCs w:val="false"/>
+                <w:color w:val="2F282D"/>
+                <w:sz w:val="18"/>
+                <w:szCs w:val="18"/>
+              </w:rPr>
+              <w:t xml:space="preserve">alternateName: Customer Support Outsourcing, Technical Support Outsourcing, Outsourced Technical Support, Help Desk Outsourcing, Contact Center Consulting, Customer Experience Consulting, Nearshore Contact Center, IT Help Desk Outsourcing, Service Desk Outsourcing, Multilingual Customer Support; hoursAvailable 24/7; Organization hasCredential ISO/IEC 27001:2022</w:t>
             </w:r>
           </w:p>
         </w:tc>
@@ -14540,7 +16058,7 @@
           <w:sz w:val="21"/>
           <w:szCs w:val="21"/>
         </w:rPr>
-        <w:t xml:space="preserve"> six answer snippets and ten FAQs match how buyers prompt AI assistants ("What does technical support outsourcing include?", "Will AI replace our support agents?").</w:t>
+        <w:t xml:space="preserve"> six answer snippets and thirteen FAQs match how buyers prompt AI assistants ("What does technical support outsourcing include?", "Will AI replace our support agents?").</w:t>
       </w:r>
     </w:p>
     <w:p>
@@ -14630,7 +16148,7 @@
           <w:sz w:val="21"/>
           <w:szCs w:val="21"/>
         </w:rPr>
-        <w:t xml:space="preserve"> with Service (including 24/7 hoursAvailable), HowTo and FAQPage linked by @id.</w:t>
+        <w:t xml:space="preserve"> with Service (including 24/7 hoursAvailable), Organization (with the ISO/IEC 27001:2022 credential), HowTo, FAQPage and VideoObject linked by @id.</w:t>
       </w:r>
     </w:p>
     <w:p>
@@ -14681,7 +16199,7 @@
           <w:sz w:val="21"/>
           <w:szCs w:val="21"/>
         </w:rPr>
-        <w:t xml:space="preserve">Proof to add:</w:t>
+        <w:t xml:space="preserve">Anonymized proof on the page:</w:t>
       </w:r>
       <w:r>
         <w:rPr>
@@ -14690,7 +16208,37 @@
           <w:sz w:val="21"/>
           <w:szCs w:val="21"/>
         </w:rPr>
-        <w:t xml:space="preserve"> one case study with before/after CSAT, FCR or cost-to-serve, and client logos from technology or SaaS companies.</w:t>
+        <w:t xml:space="preserve"> a "Support we run today" block lists six engagements by industry (for example, a US specialty sports retailer and a B2B pricing software company), backed by 30+ won support, technical support and service desk engagements. Client names stay withheld until approved; amounts are never shown.</w:t>
+      </w:r>
+    </w:p>
+    <w:p>
+      <w:pPr>
+        <w:pStyle w:val="ListParagraph"/>
+        <w:numPr>
+          <w:ilvl w:val="0"/>
+          <w:numId w:val="4"/>
+        </w:numPr>
+        <w:spacing w:after="80" w:line="276"/>
+      </w:pPr>
+      <w:r>
+        <w:rPr>
+          <w:rFonts w:ascii="Aptos" w:cs="Aptos" w:eastAsia="Aptos" w:hAnsi="Aptos"/>
+          <w:b/>
+          <w:bCs/>
+          <w:color w:val="2F282D"/>
+          <w:sz w:val="21"/>
+          <w:szCs w:val="21"/>
+        </w:rPr>
+        <w:t xml:space="preserve">Proof to add:</w:t>
+      </w:r>
+      <w:r>
+        <w:rPr>
+          <w:rFonts w:ascii="Aptos" w:cs="Aptos" w:eastAsia="Aptos" w:hAnsi="Aptos"/>
+          <w:color w:val="2F282D"/>
+          <w:sz w:val="21"/>
+          <w:szCs w:val="21"/>
+        </w:rPr>
+        <w:t xml:space="preserve"> one case study with before/after CSAT, FCR or cost-to-serve, and client logos once approved.</w:t>
       </w:r>
     </w:p>
     <w:p>
@@ -14746,7 +16294,7 @@
           <w:sz w:val="21"/>
           <w:szCs w:val="21"/>
         </w:rPr>
-        <w:t xml:space="preserve">TEAM International provides customer support outsourcing and technical support outsourcing as a managed service for mid-size and enterprise companies in North America and Europe. Nearshore agents and technical specialists handle customer care and tiered technical support 24/7, while AI automation, agent assist and CX analytics raise first contact resolution and CSAT and lower cost-to-serve, all managed against agreed SLAs.</w:t>
+        <w:t xml:space="preserve">TEAM International provides customer support outsourcing and technical support outsourcing as a managed service for mid-size and enterprise companies in North America and Europe. Multilingual nearshore agents and technical specialists handle customer care, tiered technical support and IT help desk 24/7, while AI automation, agent assist and CX analytics raise first contact resolution and CSAT and lower cost-to-serve, all managed against agreed SLAs.</w:t>
       </w:r>
     </w:p>
     <w:p>
@@ -14898,7 +16446,7 @@
           <w:sz w:val="21"/>
           <w:szCs w:val="21"/>
         </w:rPr>
-        <w:t xml:space="preserve">For complex or high-value interactions, a nearshore contact center usually delivers better results: shared time zones, strong language and cultural alignment, and easier collaboration with your product teams. TEAM International serves North America from Medellín and Europe from Ukraine, with 24/7 coverage where needed.</w:t>
+        <w:t xml:space="preserve">For complex or high-value interactions, a nearshore contact center usually delivers better results: shared time zones, multilingual teams with strong cultural alignment, and easier collaboration with your product teams. TEAM International serves North America from Medellín and Europe from Ukraine, with 24/7 coverage where needed.</w:t>
       </w:r>
     </w:p>
     <w:p>
@@ -15050,7 +16598,7 @@
         <w:pStyle w:val="Heading2"/>
       </w:pPr>
       <w:r>
-        <w:t xml:space="preserve">FAQ (10 questions)</w:t>
+        <w:t xml:space="preserve">FAQ (13 questions)</w:t>
       </w:r>
     </w:p>
     <w:p>
@@ -15194,7 +16742,7 @@
           <w:sz w:val="21"/>
           <w:szCs w:val="21"/>
         </w:rPr>
-        <w:t xml:space="preserve">Yes. We design coverage around your customers, from business hours in their time zone to always-on 24/7 support, combining nearshore teams with AI self-service for after-hours routine requests.</w:t>
+        <w:t xml:space="preserve">Yes. We design coverage around your customers, from business hours such as 8/5 or 12/7 in their time zone to always-on 24/7/365 support, combining nearshore teams with AI self-service for after-hours routine requests.</w:t>
       </w:r>
     </w:p>
     <w:p>
@@ -15242,7 +16790,7 @@
           <w:sz w:val="21"/>
           <w:szCs w:val="21"/>
         </w:rPr>
-        <w:t xml:space="preserve">We support the channels your customers use, typically phone, email, chat, messaging and in-app support, with consistent quality and reporting across all of them.</w:t>
+        <w:t xml:space="preserve">We support the channels your customers use, typically phone, email, chat, social messaging, self-service and in-app support, plus IVR and AI chatbots, with consistent quality and reporting across all of them.</w:t>
       </w:r>
     </w:p>
     <w:p>
@@ -15259,7 +16807,7 @@
           <w:sz w:val="22"/>
           <w:szCs w:val="22"/>
         </w:rPr>
-        <w:t xml:space="preserve">5. How do you measure success?</w:t>
+        <w:t xml:space="preserve">5. Do you offer IT help desk and service desk outsourcing?</w:t>
       </w:r>
       <w:r>
         <w:rPr>
@@ -15270,7 +16818,7 @@
           <w:sz w:val="18"/>
           <w:szCs w:val="18"/>
         </w:rPr>
-        <w:t xml:space="preserve">   Targets: contact center kpis</w:t>
+        <w:t xml:space="preserve">   Targets: it help desk outsourcing, service desk outsourcing, outsourced it help desk</w:t>
       </w:r>
     </w:p>
     <w:p>
@@ -15290,7 +16838,7 @@
           <w:sz w:val="21"/>
           <w:szCs w:val="21"/>
         </w:rPr>
-        <w:t xml:space="preserve">We agree on SLAs and KPIs before go-live, usually CSAT, first contact resolution, response and resolution times, SLA attainment, quality scores and cost-to-serve, and report them in real-time dashboards and monthly reviews.</w:t>
+        <w:t xml:space="preserve">Yes. Besides customer-facing support, TEAM International provides IT help desk outsourcing and service desk outsourcing for your employees: password and access requests, desktop support, incident triage and escalation to your IT team, managed against SLAs. Clients use our outsourced IT help desk alongside customer support or on its own.</w:t>
       </w:r>
     </w:p>
     <w:p>
@@ -15307,7 +16855,7 @@
           <w:sz w:val="22"/>
           <w:szCs w:val="22"/>
         </w:rPr>
-        <w:t xml:space="preserve">6. How long does the transition take?</w:t>
+        <w:t xml:space="preserve">6. Do you provide multilingual customer support?</w:t>
       </w:r>
       <w:r>
         <w:rPr>
@@ -15318,7 +16866,7 @@
           <w:sz w:val="18"/>
           <w:szCs w:val="18"/>
         </w:rPr>
-        <w:t xml:space="preserve">   Targets: transition (GEO)</w:t>
+        <w:t xml:space="preserve">   Targets: multilingual customer support, multilingual customer service, multilingual call center</w:t>
       </w:r>
     </w:p>
     <w:p>
@@ -15338,7 +16886,7 @@
           <w:sz w:val="21"/>
           <w:szCs w:val="21"/>
         </w:rPr>
-        <w:t xml:space="preserve">A typical transition takes four to eight weeks depending on product complexity and volume: assessment, service design, training and knowledge transfer, then a phased go-live with daily quality reviews.</w:t>
+        <w:t xml:space="preserve">Yes. Our teams provide multilingual customer support and multilingual customer service across voice, chat and email, so one partner can act as your multilingual call center for North American and European customers. We agree on the languages and coverage you need during the assessment.</w:t>
       </w:r>
     </w:p>
     <w:p>
@@ -15355,7 +16903,7 @@
           <w:sz w:val="22"/>
           <w:szCs w:val="22"/>
         </w:rPr>
-        <w:t xml:space="preserve">7. Will AI replace our support agents?</w:t>
+        <w:t xml:space="preserve">7. How do you measure success?</w:t>
       </w:r>
       <w:r>
         <w:rPr>
@@ -15366,7 +16914,7 @@
           <w:sz w:val="18"/>
           <w:szCs w:val="18"/>
         </w:rPr>
-        <w:t xml:space="preserve">   Targets: AI replacing agents (GEO)</w:t>
+        <w:t xml:space="preserve">   Targets: contact center kpis</w:t>
       </w:r>
     </w:p>
     <w:p>
@@ -15386,7 +16934,7 @@
           <w:sz w:val="21"/>
           <w:szCs w:val="21"/>
         </w:rPr>
-        <w:t xml:space="preserve">Not entirely. AI resolves more routine requests every year, but Gartner found 95% of customer service leaders plan to keep human agents. We use AI to remove repetitive work and assist agents, so your people focus on complex, high-value conversations.</w:t>
+        <w:t xml:space="preserve">We agree on SLAs and KPIs before go-live, usually CSAT, first contact resolution, response and resolution times, SLA attainment, quality scores and cost-to-serve, and report them in real-time dashboards and monthly reviews.</w:t>
       </w:r>
     </w:p>
     <w:p>
@@ -15403,7 +16951,7 @@
           <w:sz w:val="22"/>
           <w:szCs w:val="22"/>
         </w:rPr>
-        <w:t xml:space="preserve">8. Can you support technical and SaaS products?</w:t>
+        <w:t xml:space="preserve">8. How long does the transition take?</w:t>
       </w:r>
       <w:r>
         <w:rPr>
@@ -15414,7 +16962,7 @@
           <w:sz w:val="18"/>
           <w:szCs w:val="18"/>
         </w:rPr>
-        <w:t xml:space="preserve">   Targets: tech support outsourcing, saas customer support outsourcing</w:t>
+        <w:t xml:space="preserve">   Targets: transition (GEO)</w:t>
       </w:r>
     </w:p>
     <w:p>
@@ -15434,7 +16982,7 @@
           <w:sz w:val="21"/>
           <w:szCs w:val="21"/>
         </w:rPr>
-        <w:t xml:space="preserve">Yes. As a technology company, TEAM International staffs tech support outsourcing engagements with people who understand software, integrations, configuration and troubleshooting, which makes us a good fit for SaaS customer support outsourcing and complex B2B products.</w:t>
+        <w:t xml:space="preserve">It depends on product complexity, volume and channels. We follow a phased transition: assessment, service design, training and knowledge transfer, then a gradual go-live with daily quality reviews, so your customers never notice the handover. The assessment gives you the exact plan and timeline before you commit.</w:t>
       </w:r>
     </w:p>
     <w:p>
@@ -15451,7 +16999,7 @@
           <w:sz w:val="22"/>
           <w:szCs w:val="22"/>
         </w:rPr>
-        <w:t xml:space="preserve">9. Do you work with mid-size companies?</w:t>
+        <w:t xml:space="preserve">9. Will AI replace our support agents?</w:t>
       </w:r>
       <w:r>
         <w:rPr>
@@ -15462,7 +17010,7 @@
           <w:sz w:val="18"/>
           <w:szCs w:val="18"/>
         </w:rPr>
-        <w:t xml:space="preserve">   Targets: mid-size prompts (GEO)</w:t>
+        <w:t xml:space="preserve">   Targets: AI replacing agents (GEO)</w:t>
       </w:r>
     </w:p>
     <w:p>
@@ -15482,7 +17030,7 @@
           <w:sz w:val="21"/>
           <w:szCs w:val="21"/>
         </w:rPr>
-        <w:t xml:space="preserve">Yes. Our teams scale from a small dedicated pod to large always-on operations, so mid-size companies get enterprise-grade service management, AI and analytics without enterprise-sized contracts.</w:t>
+        <w:t xml:space="preserve">Not entirely. AI resolves more routine requests every year, but Gartner found 95% of customer service leaders plan to keep human agents. We use AI to remove repetitive work and assist agents, so your people focus on complex, high-value conversations.</w:t>
       </w:r>
     </w:p>
     <w:p>
@@ -15499,7 +17047,7 @@
           <w:sz w:val="22"/>
           <w:szCs w:val="22"/>
         </w:rPr>
-        <w:t xml:space="preserve">10. How do we start?</w:t>
+        <w:t xml:space="preserve">10. Can you support technical and SaaS products?</w:t>
       </w:r>
       <w:r>
         <w:rPr>
@@ -15510,7 +17058,7 @@
           <w:sz w:val="18"/>
           <w:szCs w:val="18"/>
         </w:rPr>
-        <w:t xml:space="preserve">   Targets: brand + call to action</w:t>
+        <w:t xml:space="preserve">   Targets: tech support outsourcing, saas customer support outsourcing</w:t>
       </w:r>
     </w:p>
     <w:p>
@@ -15530,7 +17078,151 @@
           <w:sz w:val="21"/>
           <w:szCs w:val="21"/>
         </w:rPr>
-        <w:t xml:space="preserve">Start with a Customer Care Assessment. In two to three weeks, TEAM International reviews your volumes, KPIs, tools and costs and delivers a service design, SLA proposal and improvement roadmap, so you can decide with clear scope and cost.</w:t>
+        <w:t xml:space="preserve">Yes. As a technology company, TEAM International staffs tech support outsourcing engagements with people who understand software, integrations, configuration and troubleshooting, which makes us a good fit for SaaS customer support outsourcing and complex B2B products.</w:t>
+      </w:r>
+    </w:p>
+    <w:p>
+      <w:pPr>
+        <w:keepNext/>
+        <w:spacing w:after="60" w:before="160"/>
+      </w:pPr>
+      <w:r>
+        <w:rPr>
+          <w:rFonts w:ascii="Aptos" w:cs="Aptos" w:eastAsia="Aptos" w:hAnsi="Aptos"/>
+          <w:b/>
+          <w:bCs/>
+          <w:color w:val="2F282D"/>
+          <w:sz w:val="22"/>
+          <w:szCs w:val="22"/>
+        </w:rPr>
+        <w:t xml:space="preserve">11. Do you work with mid-size companies?</w:t>
+      </w:r>
+      <w:r>
+        <w:rPr>
+          <w:rFonts w:ascii="Aptos" w:cs="Aptos" w:eastAsia="Aptos" w:hAnsi="Aptos"/>
+          <w:i/>
+          <w:iCs/>
+          <w:color w:val="756B72"/>
+          <w:sz w:val="18"/>
+          <w:szCs w:val="18"/>
+        </w:rPr>
+        <w:t xml:space="preserve">   Targets: mid-size prompts (GEO)</w:t>
+      </w:r>
+    </w:p>
+    <w:p>
+      <w:pPr>
+        <w:pBdr>
+          <w:left w:val="single" w:color="FDBE00" w:sz="18" w:space="10"/>
+        </w:pBdr>
+        <w:spacing w:after="200" w:before="80" w:line="288"/>
+        <w:ind w:left="360" w:right="240"/>
+      </w:pPr>
+      <w:r>
+        <w:rPr>
+          <w:rFonts w:ascii="Aptos" w:cs="Aptos" w:eastAsia="Aptos" w:hAnsi="Aptos"/>
+          <w:i w:val="false"/>
+          <w:iCs w:val="false"/>
+          <w:color w:val="2F282D"/>
+          <w:sz w:val="21"/>
+          <w:szCs w:val="21"/>
+        </w:rPr>
+        <w:t xml:space="preserve">Yes. Our teams scale from a small dedicated pod to large always-on operations, so mid-size companies get enterprise-grade service management, AI and analytics without enterprise-sized contracts.</w:t>
+      </w:r>
+    </w:p>
+    <w:p>
+      <w:pPr>
+        <w:keepNext/>
+        <w:spacing w:after="60" w:before="160"/>
+      </w:pPr>
+      <w:r>
+        <w:rPr>
+          <w:rFonts w:ascii="Aptos" w:cs="Aptos" w:eastAsia="Aptos" w:hAnsi="Aptos"/>
+          <w:b/>
+          <w:bCs/>
+          <w:color w:val="2F282D"/>
+          <w:sz w:val="22"/>
+          <w:szCs w:val="22"/>
+        </w:rPr>
+        <w:t xml:space="preserve">12. How do you keep customer data secure?</w:t>
+      </w:r>
+      <w:r>
+        <w:rPr>
+          <w:rFonts w:ascii="Aptos" w:cs="Aptos" w:eastAsia="Aptos" w:hAnsi="Aptos"/>
+          <w:i/>
+          <w:iCs/>
+          <w:color w:val="756B72"/>
+          <w:sz w:val="18"/>
+          <w:szCs w:val="18"/>
+        </w:rPr>
+        <w:t xml:space="preserve">   Targets: hipaa compliant call center, security (GEO)</w:t>
+      </w:r>
+    </w:p>
+    <w:p>
+      <w:pPr>
+        <w:pBdr>
+          <w:left w:val="single" w:color="FDBE00" w:sz="18" w:space="10"/>
+        </w:pBdr>
+        <w:spacing w:after="200" w:before="80" w:line="288"/>
+        <w:ind w:left="360" w:right="240"/>
+      </w:pPr>
+      <w:r>
+        <w:rPr>
+          <w:rFonts w:ascii="Aptos" w:cs="Aptos" w:eastAsia="Aptos" w:hAnsi="Aptos"/>
+          <w:i w:val="false"/>
+          <w:iCs w:val="false"/>
+          <w:color w:val="2F282D"/>
+          <w:sz w:val="21"/>
+          <w:szCs w:val="21"/>
+        </w:rPr>
+        <w:t xml:space="preserve">All TEAM International locations are ISO/IEC 27001:2022 certified. For healthcare clients that need a HIPAA compliant call center or help desk, our people complete HIPAA security awareness training and work under the HIPAA Security and Privacy Rules, and we sign GDPR-compliant data processing terms for European customer data.</w:t>
+      </w:r>
+    </w:p>
+    <w:p>
+      <w:pPr>
+        <w:keepNext/>
+        <w:spacing w:after="60" w:before="160"/>
+      </w:pPr>
+      <w:r>
+        <w:rPr>
+          <w:rFonts w:ascii="Aptos" w:cs="Aptos" w:eastAsia="Aptos" w:hAnsi="Aptos"/>
+          <w:b/>
+          <w:bCs/>
+          <w:color w:val="2F282D"/>
+          <w:sz w:val="22"/>
+          <w:szCs w:val="22"/>
+        </w:rPr>
+        <w:t xml:space="preserve">13. How do we start?</w:t>
+      </w:r>
+      <w:r>
+        <w:rPr>
+          <w:rFonts w:ascii="Aptos" w:cs="Aptos" w:eastAsia="Aptos" w:hAnsi="Aptos"/>
+          <w:i/>
+          <w:iCs/>
+          <w:color w:val="756B72"/>
+          <w:sz w:val="18"/>
+          <w:szCs w:val="18"/>
+        </w:rPr>
+        <w:t xml:space="preserve">   Targets: brand + call to action</w:t>
+      </w:r>
+    </w:p>
+    <w:p>
+      <w:pPr>
+        <w:pBdr>
+          <w:left w:val="single" w:color="FDBE00" w:sz="18" w:space="10"/>
+        </w:pBdr>
+        <w:spacing w:after="200" w:before="80" w:line="288"/>
+        <w:ind w:left="360" w:right="240"/>
+      </w:pPr>
+      <w:r>
+        <w:rPr>
+          <w:rFonts w:ascii="Aptos" w:cs="Aptos" w:eastAsia="Aptos" w:hAnsi="Aptos"/>
+          <w:i w:val="false"/>
+          <w:iCs w:val="false"/>
+          <w:color w:val="2F282D"/>
+          <w:sz w:val="21"/>
+          <w:szCs w:val="21"/>
+        </w:rPr>
+        <w:t xml:space="preserve">Start with a Customer Care Assessment. TEAM International reviews your volumes, KPIs, tools and costs and delivers a service design, SLA proposal, transition plan and improvement roadmap, so you can decide with clear scope and cost.</w:t>
       </w:r>
     </w:p>
     <w:p>
@@ -15786,7 +17478,7 @@
           <w:sz w:val="21"/>
           <w:szCs w:val="21"/>
         </w:rPr>
-        <w:t xml:space="preserve"> Skilled nearshore agents handle conversations that need judgment and empathy, with AI suggesting answers and summarizing cases.</w:t>
+        <w:t xml:space="preserve"> Skilled, multilingual nearshore agents handle conversations that need judgment and empathy, with AI suggesting answers and summarizing cases.</w:t>
       </w:r>
     </w:p>
     <w:p>
@@ -16026,7 +17718,7 @@
           <w:sz w:val="15"/>
           <w:szCs w:val="15"/>
         </w:rPr>
-        <w:t xml:space="preserve">      "description": "Customer support outsourcing and technical support outsourcing for mid-size companies: nearshore agents, AI automation and CX analytics, 24/7.",</w:t>
+        <w:t xml:space="preserve">      "description": "Customer support outsourcing and technical support outsourcing for mid-size companies: multilingual nearshore teams, AI automation and CX analytics, 24/7.",</w:t>
       </w:r>
     </w:p>
     <w:p>
@@ -16762,7 +18454,103 @@
           <w:sz w:val="15"/>
           <w:szCs w:val="15"/>
         </w:rPr>
-        <w:t xml:space="preserve">      "logo": "https://www.teaminternational.com/team-international-logo-light-bg.png"</w:t>
+        <w:t xml:space="preserve">      "logo": "https://www.teaminternational.com/team-international-logo-light-bg.png",</w:t>
+      </w:r>
+    </w:p>
+    <w:p>
+      <w:pPr>
+        <w:shd w:fill="F4F1F3" w:color="auto" w:val="clear"/>
+        <w:spacing w:after="0" w:line="240"/>
+        <w:ind w:left="120" w:right="120"/>
+      </w:pPr>
+      <w:r>
+        <w:rPr>
+          <w:rFonts w:ascii="Consolas" w:cs="Consolas" w:eastAsia="Consolas" w:hAnsi="Consolas"/>
+          <w:color w:val="2F282D"/>
+          <w:sz w:val="15"/>
+          <w:szCs w:val="15"/>
+        </w:rPr>
+        <w:t xml:space="preserve">      "hasCredential": {</w:t>
+      </w:r>
+    </w:p>
+    <w:p>
+      <w:pPr>
+        <w:shd w:fill="F4F1F3" w:color="auto" w:val="clear"/>
+        <w:spacing w:after="0" w:line="240"/>
+        <w:ind w:left="120" w:right="120"/>
+      </w:pPr>
+      <w:r>
+        <w:rPr>
+          <w:rFonts w:ascii="Consolas" w:cs="Consolas" w:eastAsia="Consolas" w:hAnsi="Consolas"/>
+          <w:color w:val="2F282D"/>
+          <w:sz w:val="15"/>
+          <w:szCs w:val="15"/>
+        </w:rPr>
+        <w:t xml:space="preserve">        "@type": "EducationalOccupationalCredential",</w:t>
+      </w:r>
+    </w:p>
+    <w:p>
+      <w:pPr>
+        <w:shd w:fill="F4F1F3" w:color="auto" w:val="clear"/>
+        <w:spacing w:after="0" w:line="240"/>
+        <w:ind w:left="120" w:right="120"/>
+      </w:pPr>
+      <w:r>
+        <w:rPr>
+          <w:rFonts w:ascii="Consolas" w:cs="Consolas" w:eastAsia="Consolas" w:hAnsi="Consolas"/>
+          <w:color w:val="2F282D"/>
+          <w:sz w:val="15"/>
+          <w:szCs w:val="15"/>
+        </w:rPr>
+        <w:t xml:space="preserve">        "name": "ISO/IEC 27001:2022",</w:t>
+      </w:r>
+    </w:p>
+    <w:p>
+      <w:pPr>
+        <w:shd w:fill="F4F1F3" w:color="auto" w:val="clear"/>
+        <w:spacing w:after="0" w:line="240"/>
+        <w:ind w:left="120" w:right="120"/>
+      </w:pPr>
+      <w:r>
+        <w:rPr>
+          <w:rFonts w:ascii="Consolas" w:cs="Consolas" w:eastAsia="Consolas" w:hAnsi="Consolas"/>
+          <w:color w:val="2F282D"/>
+          <w:sz w:val="15"/>
+          <w:szCs w:val="15"/>
+        </w:rPr>
+        <w:t xml:space="preserve">        "credentialCategory": "certification",</w:t>
+      </w:r>
+    </w:p>
+    <w:p>
+      <w:pPr>
+        <w:shd w:fill="F4F1F3" w:color="auto" w:val="clear"/>
+        <w:spacing w:after="0" w:line="240"/>
+        <w:ind w:left="120" w:right="120"/>
+      </w:pPr>
+      <w:r>
+        <w:rPr>
+          <w:rFonts w:ascii="Consolas" w:cs="Consolas" w:eastAsia="Consolas" w:hAnsi="Consolas"/>
+          <w:color w:val="2F282D"/>
+          <w:sz w:val="15"/>
+          <w:szCs w:val="15"/>
+        </w:rPr>
+        <w:t xml:space="preserve">        "identifier": "372-02-270-00301"</w:t>
+      </w:r>
+    </w:p>
+    <w:p>
+      <w:pPr>
+        <w:shd w:fill="F4F1F3" w:color="auto" w:val="clear"/>
+        <w:spacing w:after="0" w:line="240"/>
+        <w:ind w:left="120" w:right="120"/>
+      </w:pPr>
+      <w:r>
+        <w:rPr>
+          <w:rFonts w:ascii="Consolas" w:cs="Consolas" w:eastAsia="Consolas" w:hAnsi="Consolas"/>
+          <w:color w:val="2F282D"/>
+          <w:sz w:val="15"/>
+          <w:szCs w:val="15"/>
+        </w:rPr>
+        <w:t xml:space="preserve">      }</w:t>
       </w:r>
     </w:p>
     <w:p>
@@ -16970,7 +18758,55 @@
           <w:sz w:val="15"/>
           <w:szCs w:val="15"/>
         </w:rPr>
-        <w:t xml:space="preserve">        "Nearshore Contact Center"</w:t>
+        <w:t xml:space="preserve">        "Nearshore Contact Center",</w:t>
+      </w:r>
+    </w:p>
+    <w:p>
+      <w:pPr>
+        <w:shd w:fill="F4F1F3" w:color="auto" w:val="clear"/>
+        <w:spacing w:after="0" w:line="240"/>
+        <w:ind w:left="120" w:right="120"/>
+      </w:pPr>
+      <w:r>
+        <w:rPr>
+          <w:rFonts w:ascii="Consolas" w:cs="Consolas" w:eastAsia="Consolas" w:hAnsi="Consolas"/>
+          <w:color w:val="2F282D"/>
+          <w:sz w:val="15"/>
+          <w:szCs w:val="15"/>
+        </w:rPr>
+        <w:t xml:space="preserve">        "IT Help Desk Outsourcing",</w:t>
+      </w:r>
+    </w:p>
+    <w:p>
+      <w:pPr>
+        <w:shd w:fill="F4F1F3" w:color="auto" w:val="clear"/>
+        <w:spacing w:after="0" w:line="240"/>
+        <w:ind w:left="120" w:right="120"/>
+      </w:pPr>
+      <w:r>
+        <w:rPr>
+          <w:rFonts w:ascii="Consolas" w:cs="Consolas" w:eastAsia="Consolas" w:hAnsi="Consolas"/>
+          <w:color w:val="2F282D"/>
+          <w:sz w:val="15"/>
+          <w:szCs w:val="15"/>
+        </w:rPr>
+        <w:t xml:space="preserve">        "Service Desk Outsourcing",</w:t>
+      </w:r>
+    </w:p>
+    <w:p>
+      <w:pPr>
+        <w:shd w:fill="F4F1F3" w:color="auto" w:val="clear"/>
+        <w:spacing w:after="0" w:line="240"/>
+        <w:ind w:left="120" w:right="120"/>
+      </w:pPr>
+      <w:r>
+        <w:rPr>
+          <w:rFonts w:ascii="Consolas" w:cs="Consolas" w:eastAsia="Consolas" w:hAnsi="Consolas"/>
+          <w:color w:val="2F282D"/>
+          <w:sz w:val="15"/>
+          <w:szCs w:val="15"/>
+        </w:rPr>
+        <w:t xml:space="preserve">        "Multilingual Customer Support"</w:t>
       </w:r>
     </w:p>
     <w:p>
@@ -17866,7 +19702,7 @@
           <w:sz w:val="15"/>
           <w:szCs w:val="15"/>
         </w:rPr>
-        <w:t xml:space="preserve">              "description": "Outsourced technical support, help desk outsourcing and customer care across tiers and channels, with agents trained on your products and specialists for complex technical issues, 24/7. Outcome: Faster response and resolution, higher CSAT and FCR, reliable always-on support."</w:t>
+        <w:t xml:space="preserve">              "description": "Outsourced technical support, customer care and IT help desk outsourcing across tiers and channels, with multilingual agents trained on your products and specialists for complex technical issues, 24/7. Outcome: Faster response and resolution, higher CSAT and FCR, reliable always-on support."</w:t>
       </w:r>
     </w:p>
     <w:p>
@@ -19776,7 +21612,7 @@
           <w:sz w:val="15"/>
           <w:szCs w:val="15"/>
         </w:rPr>
-        <w:t xml:space="preserve">        "text": "Yes. We design coverage around your customers, from business hours in their time zone to always-on 24/7 support, combining nearshore teams with AI self-service for after-hours routine requests."</w:t>
+        <w:t xml:space="preserve">        "text": "Yes. We design coverage around your customers, from business hours such as 8/5 or 12/7 in their time zone to always-on 24/7/365 support, combining nearshore teams with AI self-service for after-hours routine requests."</w:t>
       </w:r>
     </w:p>
     <w:p>
@@ -19904,7 +21740,7 @@
           <w:sz w:val="15"/>
           <w:szCs w:val="15"/>
         </w:rPr>
-        <w:t xml:space="preserve">        "text": "We support the channels your customers use, typically phone, email, chat, messaging and in-app support, with consistent quality and reporting across all of them."</w:t>
+        <w:t xml:space="preserve">        "text": "We support the channels your customers use, typically phone, email, chat, social messaging, self-service and in-app support, plus IVR and AI chatbots, with consistent quality and reporting across all of them."</w:t>
       </w:r>
     </w:p>
     <w:p>
@@ -19984,6 +21820,262 @@
           <w:sz w:val="15"/>
           <w:szCs w:val="15"/>
         </w:rPr>
+        <w:t xml:space="preserve">      "name": "Do you offer IT help desk and service desk outsourcing?",</w:t>
+      </w:r>
+    </w:p>
+    <w:p>
+      <w:pPr>
+        <w:shd w:fill="F4F1F3" w:color="auto" w:val="clear"/>
+        <w:spacing w:after="0" w:line="240"/>
+        <w:ind w:left="120" w:right="120"/>
+      </w:pPr>
+      <w:r>
+        <w:rPr>
+          <w:rFonts w:ascii="Consolas" w:cs="Consolas" w:eastAsia="Consolas" w:hAnsi="Consolas"/>
+          <w:color w:val="2F282D"/>
+          <w:sz w:val="15"/>
+          <w:szCs w:val="15"/>
+        </w:rPr>
+        <w:t xml:space="preserve">      "acceptedAnswer": {</w:t>
+      </w:r>
+    </w:p>
+    <w:p>
+      <w:pPr>
+        <w:shd w:fill="F4F1F3" w:color="auto" w:val="clear"/>
+        <w:spacing w:after="0" w:line="240"/>
+        <w:ind w:left="120" w:right="120"/>
+      </w:pPr>
+      <w:r>
+        <w:rPr>
+          <w:rFonts w:ascii="Consolas" w:cs="Consolas" w:eastAsia="Consolas" w:hAnsi="Consolas"/>
+          <w:color w:val="2F282D"/>
+          <w:sz w:val="15"/>
+          <w:szCs w:val="15"/>
+        </w:rPr>
+        <w:t xml:space="preserve">        "@type": "Answer",</w:t>
+      </w:r>
+    </w:p>
+    <w:p>
+      <w:pPr>
+        <w:shd w:fill="F4F1F3" w:color="auto" w:val="clear"/>
+        <w:spacing w:after="0" w:line="240"/>
+        <w:ind w:left="120" w:right="120"/>
+      </w:pPr>
+      <w:r>
+        <w:rPr>
+          <w:rFonts w:ascii="Consolas" w:cs="Consolas" w:eastAsia="Consolas" w:hAnsi="Consolas"/>
+          <w:color w:val="2F282D"/>
+          <w:sz w:val="15"/>
+          <w:szCs w:val="15"/>
+        </w:rPr>
+        <w:t xml:space="preserve">        "text": "Yes. Besides customer-facing support, TEAM International provides IT help desk outsourcing and service desk outsourcing for your employees: password and access requests, desktop support, incident triage and escalation to your IT team, managed against SLAs. Clients use our outsourced IT help desk alongside customer support or on its own."</w:t>
+      </w:r>
+    </w:p>
+    <w:p>
+      <w:pPr>
+        <w:shd w:fill="F4F1F3" w:color="auto" w:val="clear"/>
+        <w:spacing w:after="0" w:line="240"/>
+        <w:ind w:left="120" w:right="120"/>
+      </w:pPr>
+      <w:r>
+        <w:rPr>
+          <w:rFonts w:ascii="Consolas" w:cs="Consolas" w:eastAsia="Consolas" w:hAnsi="Consolas"/>
+          <w:color w:val="2F282D"/>
+          <w:sz w:val="15"/>
+          <w:szCs w:val="15"/>
+        </w:rPr>
+        <w:t xml:space="preserve">      }</w:t>
+      </w:r>
+    </w:p>
+    <w:p>
+      <w:pPr>
+        <w:shd w:fill="F4F1F3" w:color="auto" w:val="clear"/>
+        <w:spacing w:after="0" w:line="240"/>
+        <w:ind w:left="120" w:right="120"/>
+      </w:pPr>
+      <w:r>
+        <w:rPr>
+          <w:rFonts w:ascii="Consolas" w:cs="Consolas" w:eastAsia="Consolas" w:hAnsi="Consolas"/>
+          <w:color w:val="2F282D"/>
+          <w:sz w:val="15"/>
+          <w:szCs w:val="15"/>
+        </w:rPr>
+        <w:t xml:space="preserve">    },</w:t>
+      </w:r>
+    </w:p>
+    <w:p>
+      <w:pPr>
+        <w:shd w:fill="F4F1F3" w:color="auto" w:val="clear"/>
+        <w:spacing w:after="0" w:line="240"/>
+        <w:ind w:left="120" w:right="120"/>
+      </w:pPr>
+      <w:r>
+        <w:rPr>
+          <w:rFonts w:ascii="Consolas" w:cs="Consolas" w:eastAsia="Consolas" w:hAnsi="Consolas"/>
+          <w:color w:val="2F282D"/>
+          <w:sz w:val="15"/>
+          <w:szCs w:val="15"/>
+        </w:rPr>
+        <w:t xml:space="preserve">    {</w:t>
+      </w:r>
+    </w:p>
+    <w:p>
+      <w:pPr>
+        <w:shd w:fill="F4F1F3" w:color="auto" w:val="clear"/>
+        <w:spacing w:after="0" w:line="240"/>
+        <w:ind w:left="120" w:right="120"/>
+      </w:pPr>
+      <w:r>
+        <w:rPr>
+          <w:rFonts w:ascii="Consolas" w:cs="Consolas" w:eastAsia="Consolas" w:hAnsi="Consolas"/>
+          <w:color w:val="2F282D"/>
+          <w:sz w:val="15"/>
+          <w:szCs w:val="15"/>
+        </w:rPr>
+        <w:t xml:space="preserve">      "@type": "Question",</w:t>
+      </w:r>
+    </w:p>
+    <w:p>
+      <w:pPr>
+        <w:shd w:fill="F4F1F3" w:color="auto" w:val="clear"/>
+        <w:spacing w:after="0" w:line="240"/>
+        <w:ind w:left="120" w:right="120"/>
+      </w:pPr>
+      <w:r>
+        <w:rPr>
+          <w:rFonts w:ascii="Consolas" w:cs="Consolas" w:eastAsia="Consolas" w:hAnsi="Consolas"/>
+          <w:color w:val="2F282D"/>
+          <w:sz w:val="15"/>
+          <w:szCs w:val="15"/>
+        </w:rPr>
+        <w:t xml:space="preserve">      "name": "Do you provide multilingual customer support?",</w:t>
+      </w:r>
+    </w:p>
+    <w:p>
+      <w:pPr>
+        <w:shd w:fill="F4F1F3" w:color="auto" w:val="clear"/>
+        <w:spacing w:after="0" w:line="240"/>
+        <w:ind w:left="120" w:right="120"/>
+      </w:pPr>
+      <w:r>
+        <w:rPr>
+          <w:rFonts w:ascii="Consolas" w:cs="Consolas" w:eastAsia="Consolas" w:hAnsi="Consolas"/>
+          <w:color w:val="2F282D"/>
+          <w:sz w:val="15"/>
+          <w:szCs w:val="15"/>
+        </w:rPr>
+        <w:t xml:space="preserve">      "acceptedAnswer": {</w:t>
+      </w:r>
+    </w:p>
+    <w:p>
+      <w:pPr>
+        <w:shd w:fill="F4F1F3" w:color="auto" w:val="clear"/>
+        <w:spacing w:after="0" w:line="240"/>
+        <w:ind w:left="120" w:right="120"/>
+      </w:pPr>
+      <w:r>
+        <w:rPr>
+          <w:rFonts w:ascii="Consolas" w:cs="Consolas" w:eastAsia="Consolas" w:hAnsi="Consolas"/>
+          <w:color w:val="2F282D"/>
+          <w:sz w:val="15"/>
+          <w:szCs w:val="15"/>
+        </w:rPr>
+        <w:t xml:space="preserve">        "@type": "Answer",</w:t>
+      </w:r>
+    </w:p>
+    <w:p>
+      <w:pPr>
+        <w:shd w:fill="F4F1F3" w:color="auto" w:val="clear"/>
+        <w:spacing w:after="0" w:line="240"/>
+        <w:ind w:left="120" w:right="120"/>
+      </w:pPr>
+      <w:r>
+        <w:rPr>
+          <w:rFonts w:ascii="Consolas" w:cs="Consolas" w:eastAsia="Consolas" w:hAnsi="Consolas"/>
+          <w:color w:val="2F282D"/>
+          <w:sz w:val="15"/>
+          <w:szCs w:val="15"/>
+        </w:rPr>
+        <w:t xml:space="preserve">        "text": "Yes. Our teams provide multilingual customer support and multilingual customer service across voice, chat and email, so one partner can act as your multilingual call center for North American and European customers. We agree on the languages and coverage you need during the assessment."</w:t>
+      </w:r>
+    </w:p>
+    <w:p>
+      <w:pPr>
+        <w:shd w:fill="F4F1F3" w:color="auto" w:val="clear"/>
+        <w:spacing w:after="0" w:line="240"/>
+        <w:ind w:left="120" w:right="120"/>
+      </w:pPr>
+      <w:r>
+        <w:rPr>
+          <w:rFonts w:ascii="Consolas" w:cs="Consolas" w:eastAsia="Consolas" w:hAnsi="Consolas"/>
+          <w:color w:val="2F282D"/>
+          <w:sz w:val="15"/>
+          <w:szCs w:val="15"/>
+        </w:rPr>
+        <w:t xml:space="preserve">      }</w:t>
+      </w:r>
+    </w:p>
+    <w:p>
+      <w:pPr>
+        <w:shd w:fill="F4F1F3" w:color="auto" w:val="clear"/>
+        <w:spacing w:after="0" w:line="240"/>
+        <w:ind w:left="120" w:right="120"/>
+      </w:pPr>
+      <w:r>
+        <w:rPr>
+          <w:rFonts w:ascii="Consolas" w:cs="Consolas" w:eastAsia="Consolas" w:hAnsi="Consolas"/>
+          <w:color w:val="2F282D"/>
+          <w:sz w:val="15"/>
+          <w:szCs w:val="15"/>
+        </w:rPr>
+        <w:t xml:space="preserve">    },</w:t>
+      </w:r>
+    </w:p>
+    <w:p>
+      <w:pPr>
+        <w:shd w:fill="F4F1F3" w:color="auto" w:val="clear"/>
+        <w:spacing w:after="0" w:line="240"/>
+        <w:ind w:left="120" w:right="120"/>
+      </w:pPr>
+      <w:r>
+        <w:rPr>
+          <w:rFonts w:ascii="Consolas" w:cs="Consolas" w:eastAsia="Consolas" w:hAnsi="Consolas"/>
+          <w:color w:val="2F282D"/>
+          <w:sz w:val="15"/>
+          <w:szCs w:val="15"/>
+        </w:rPr>
+        <w:t xml:space="preserve">    {</w:t>
+      </w:r>
+    </w:p>
+    <w:p>
+      <w:pPr>
+        <w:shd w:fill="F4F1F3" w:color="auto" w:val="clear"/>
+        <w:spacing w:after="0" w:line="240"/>
+        <w:ind w:left="120" w:right="120"/>
+      </w:pPr>
+      <w:r>
+        <w:rPr>
+          <w:rFonts w:ascii="Consolas" w:cs="Consolas" w:eastAsia="Consolas" w:hAnsi="Consolas"/>
+          <w:color w:val="2F282D"/>
+          <w:sz w:val="15"/>
+          <w:szCs w:val="15"/>
+        </w:rPr>
+        <w:t xml:space="preserve">      "@type": "Question",</w:t>
+      </w:r>
+    </w:p>
+    <w:p>
+      <w:pPr>
+        <w:shd w:fill="F4F1F3" w:color="auto" w:val="clear"/>
+        <w:spacing w:after="0" w:line="240"/>
+        <w:ind w:left="120" w:right="120"/>
+      </w:pPr>
+      <w:r>
+        <w:rPr>
+          <w:rFonts w:ascii="Consolas" w:cs="Consolas" w:eastAsia="Consolas" w:hAnsi="Consolas"/>
+          <w:color w:val="2F282D"/>
+          <w:sz w:val="15"/>
+          <w:szCs w:val="15"/>
+        </w:rPr>
         <w:t xml:space="preserve">      "name": "How do you measure success?",</w:t>
       </w:r>
     </w:p>
@@ -20160,7 +22252,7 @@
           <w:sz w:val="15"/>
           <w:szCs w:val="15"/>
         </w:rPr>
-        <w:t xml:space="preserve">        "text": "A typical transition takes four to eight weeks depending on product complexity and volume: assessment, service design, training and knowledge transfer, then a phased go-live with daily quality reviews."</w:t>
+        <w:t xml:space="preserve">        "text": "It depends on product complexity, volume and channels. We follow a phased transition: assessment, service design, training and knowledge transfer, then a gradual go-live with daily quality reviews, so your customers never notice the handover. The assessment gives you the exact plan and timeline before you commit."</w:t>
       </w:r>
     </w:p>
     <w:p>
@@ -20624,6 +22716,134 @@
           <w:sz w:val="15"/>
           <w:szCs w:val="15"/>
         </w:rPr>
+        <w:t xml:space="preserve">      "name": "How do you keep customer data secure?",</w:t>
+      </w:r>
+    </w:p>
+    <w:p>
+      <w:pPr>
+        <w:shd w:fill="F4F1F3" w:color="auto" w:val="clear"/>
+        <w:spacing w:after="0" w:line="240"/>
+        <w:ind w:left="120" w:right="120"/>
+      </w:pPr>
+      <w:r>
+        <w:rPr>
+          <w:rFonts w:ascii="Consolas" w:cs="Consolas" w:eastAsia="Consolas" w:hAnsi="Consolas"/>
+          <w:color w:val="2F282D"/>
+          <w:sz w:val="15"/>
+          <w:szCs w:val="15"/>
+        </w:rPr>
+        <w:t xml:space="preserve">      "acceptedAnswer": {</w:t>
+      </w:r>
+    </w:p>
+    <w:p>
+      <w:pPr>
+        <w:shd w:fill="F4F1F3" w:color="auto" w:val="clear"/>
+        <w:spacing w:after="0" w:line="240"/>
+        <w:ind w:left="120" w:right="120"/>
+      </w:pPr>
+      <w:r>
+        <w:rPr>
+          <w:rFonts w:ascii="Consolas" w:cs="Consolas" w:eastAsia="Consolas" w:hAnsi="Consolas"/>
+          <w:color w:val="2F282D"/>
+          <w:sz w:val="15"/>
+          <w:szCs w:val="15"/>
+        </w:rPr>
+        <w:t xml:space="preserve">        "@type": "Answer",</w:t>
+      </w:r>
+    </w:p>
+    <w:p>
+      <w:pPr>
+        <w:shd w:fill="F4F1F3" w:color="auto" w:val="clear"/>
+        <w:spacing w:after="0" w:line="240"/>
+        <w:ind w:left="120" w:right="120"/>
+      </w:pPr>
+      <w:r>
+        <w:rPr>
+          <w:rFonts w:ascii="Consolas" w:cs="Consolas" w:eastAsia="Consolas" w:hAnsi="Consolas"/>
+          <w:color w:val="2F282D"/>
+          <w:sz w:val="15"/>
+          <w:szCs w:val="15"/>
+        </w:rPr>
+        <w:t xml:space="preserve">        "text": "All TEAM International locations are ISO/IEC 27001:2022 certified. For healthcare clients that need a HIPAA compliant call center or help desk, our people complete HIPAA security awareness training and work under the HIPAA Security and Privacy Rules, and we sign GDPR-compliant data processing terms for European customer data."</w:t>
+      </w:r>
+    </w:p>
+    <w:p>
+      <w:pPr>
+        <w:shd w:fill="F4F1F3" w:color="auto" w:val="clear"/>
+        <w:spacing w:after="0" w:line="240"/>
+        <w:ind w:left="120" w:right="120"/>
+      </w:pPr>
+      <w:r>
+        <w:rPr>
+          <w:rFonts w:ascii="Consolas" w:cs="Consolas" w:eastAsia="Consolas" w:hAnsi="Consolas"/>
+          <w:color w:val="2F282D"/>
+          <w:sz w:val="15"/>
+          <w:szCs w:val="15"/>
+        </w:rPr>
+        <w:t xml:space="preserve">      }</w:t>
+      </w:r>
+    </w:p>
+    <w:p>
+      <w:pPr>
+        <w:shd w:fill="F4F1F3" w:color="auto" w:val="clear"/>
+        <w:spacing w:after="0" w:line="240"/>
+        <w:ind w:left="120" w:right="120"/>
+      </w:pPr>
+      <w:r>
+        <w:rPr>
+          <w:rFonts w:ascii="Consolas" w:cs="Consolas" w:eastAsia="Consolas" w:hAnsi="Consolas"/>
+          <w:color w:val="2F282D"/>
+          <w:sz w:val="15"/>
+          <w:szCs w:val="15"/>
+        </w:rPr>
+        <w:t xml:space="preserve">    },</w:t>
+      </w:r>
+    </w:p>
+    <w:p>
+      <w:pPr>
+        <w:shd w:fill="F4F1F3" w:color="auto" w:val="clear"/>
+        <w:spacing w:after="0" w:line="240"/>
+        <w:ind w:left="120" w:right="120"/>
+      </w:pPr>
+      <w:r>
+        <w:rPr>
+          <w:rFonts w:ascii="Consolas" w:cs="Consolas" w:eastAsia="Consolas" w:hAnsi="Consolas"/>
+          <w:color w:val="2F282D"/>
+          <w:sz w:val="15"/>
+          <w:szCs w:val="15"/>
+        </w:rPr>
+        <w:t xml:space="preserve">    {</w:t>
+      </w:r>
+    </w:p>
+    <w:p>
+      <w:pPr>
+        <w:shd w:fill="F4F1F3" w:color="auto" w:val="clear"/>
+        <w:spacing w:after="0" w:line="240"/>
+        <w:ind w:left="120" w:right="120"/>
+      </w:pPr>
+      <w:r>
+        <w:rPr>
+          <w:rFonts w:ascii="Consolas" w:cs="Consolas" w:eastAsia="Consolas" w:hAnsi="Consolas"/>
+          <w:color w:val="2F282D"/>
+          <w:sz w:val="15"/>
+          <w:szCs w:val="15"/>
+        </w:rPr>
+        <w:t xml:space="preserve">      "@type": "Question",</w:t>
+      </w:r>
+    </w:p>
+    <w:p>
+      <w:pPr>
+        <w:shd w:fill="F4F1F3" w:color="auto" w:val="clear"/>
+        <w:spacing w:after="0" w:line="240"/>
+        <w:ind w:left="120" w:right="120"/>
+      </w:pPr>
+      <w:r>
+        <w:rPr>
+          <w:rFonts w:ascii="Consolas" w:cs="Consolas" w:eastAsia="Consolas" w:hAnsi="Consolas"/>
+          <w:color w:val="2F282D"/>
+          <w:sz w:val="15"/>
+          <w:szCs w:val="15"/>
+        </w:rPr>
         <w:t xml:space="preserve">      "name": "How do we start?",</w:t>
       </w:r>
     </w:p>
@@ -20672,7 +22892,7 @@
           <w:sz w:val="15"/>
           <w:szCs w:val="15"/>
         </w:rPr>
-        <w:t xml:space="preserve">        "text": "Start with a Customer Care Assessment. In two to three weeks, TEAM International reviews your volumes, KPIs, tools and costs and delivers a service design, SLA proposal and improvement roadmap, so you can decide with clear scope and cost."</w:t>
+        <w:t xml:space="preserve">        "text": "Start with a Customer Care Assessment. TEAM International reviews your volumes, KPIs, tools and costs and delivers a service design, SLA proposal, transition plan and improvement roadmap, so you can decide with clear scope and cost."</w:t>
       </w:r>
     </w:p>
     <w:p>
@@ -21009,7 +23229,7 @@
                 <w:sz w:val="18"/>
                 <w:szCs w:val="18"/>
               </w:rPr>
-              <w:t xml:space="preserve">Confirm supported languages (e.g., English and Spanish from Medellín; which European languages from Ukraine)</w:t>
+              <w:t xml:space="preserve">Languages: RESOLVED for now. The page says "multilingual" without naming languages (decision Oct 15, 2026)</w:t>
             </w:r>
           </w:p>
         </w:tc>
@@ -21071,7 +23291,7 @@
                 <w:sz w:val="18"/>
                 <w:szCs w:val="18"/>
               </w:rPr>
-              <w:t xml:space="preserve">"Bilingual" and "multilingual customer support" (880/mo) are valuable terms, but only if true</w:t>
+              <w:t xml:space="preserve">Name specific languages later to add "bilingual" and language-specific terms</w:t>
             </w:r>
           </w:p>
         </w:tc>
@@ -21108,7 +23328,7 @@
                 <w:sz w:val="18"/>
                 <w:szCs w:val="18"/>
               </w:rPr>
-              <w:t xml:space="preserve">Confirm whether TEAM offers internal IT help desk / service desk</w:t>
+              <w:t xml:space="preserve">IT help desk / service desk: CONFIRMED (Atrium, Surge Energy, Exclaimer, Hibbett Sports deals)</w:t>
             </w:r>
           </w:p>
         </w:tc>
@@ -21172,7 +23392,7 @@
                 <w:sz w:val="18"/>
                 <w:szCs w:val="18"/>
               </w:rPr>
-              <w:t xml:space="preserve">Unlocks "IT help desk outsourcing" (1,300/mo, KD 20) and "service desk outsourcing" (590/mo, KD 13)</w:t>
+              <w:t xml:space="preserve">Now targets "IT help desk outsourcing" and "service desk outsourcing"</w:t>
             </w:r>
           </w:p>
         </w:tc>
@@ -21208,7 +23428,7 @@
                 <w:sz w:val="18"/>
                 <w:szCs w:val="18"/>
               </w:rPr>
-              <w:t xml:space="preserve">Confirm 24/7 coverage model and transition length (4–8 weeks assumed)</w:t>
+              <w:t xml:space="preserve">24/7: CONFIRMED (24/7/365, plus 8/5, 12/5, 12/7 options on the current site). Transition length: OPEN, page says "phased transition" with no week count</w:t>
             </w:r>
           </w:p>
         </w:tc>
@@ -21270,7 +23490,7 @@
                 <w:sz w:val="18"/>
                 <w:szCs w:val="18"/>
               </w:rPr>
-              <w:t xml:space="preserve">The page promises both</w:t>
+              <w:t xml:space="preserve">Add week counts once confirmed</w:t>
             </w:r>
           </w:p>
         </w:tc>
@@ -21307,7 +23527,7 @@
                 <w:sz w:val="18"/>
                 <w:szCs w:val="18"/>
               </w:rPr>
-              <w:t xml:space="preserve">Confirm assessment length (2–3 weeks assumed) and name ("Customer Care Assessment")</w:t>
+              <w:t xml:space="preserve">Assessment length: OPEN, page says "Customer Care Assessment" with no week count</w:t>
             </w:r>
           </w:p>
         </w:tc>
@@ -21407,7 +23627,7 @@
                 <w:sz w:val="18"/>
                 <w:szCs w:val="18"/>
               </w:rPr>
-              <w:t xml:space="preserve">Confirm security and compliance credentials to mention (e.g., ISO 27001, SOC 2, HIPAA, PCI)</w:t>
+              <w:t xml:space="preserve">Security: CONFIRMED ISO/IEC 27001:2022 (cert. 372-02-270-00301, all locations), HIPAA, GDPR. SOC 2 and PCI not claimed</w:t>
             </w:r>
           </w:p>
         </w:tc>
@@ -21469,7 +23689,7 @@
                 <w:sz w:val="18"/>
                 <w:szCs w:val="18"/>
               </w:rPr>
-              <w:t xml:space="preserve">Strong trust signal for buyers and AI engines; omitted until confirmed</w:t>
+              <w:t xml:space="preserve">Source: teaminternational.com/en/compliance</w:t>
             </w:r>
           </w:p>
         </w:tc>
@@ -21506,7 +23726,7 @@
                 <w:sz w:val="18"/>
                 <w:szCs w:val="18"/>
               </w:rPr>
-              <w:t xml:space="preserve">Decide what happens to /customer-support-services and /contact-center-solutions</w:t>
+              <w:t xml:space="preserve">Client names: OPEN, proof block is anonymized</w:t>
             </w:r>
           </w:p>
         </w:tc>
@@ -21570,7 +23790,7 @@
                 <w:sz w:val="18"/>
                 <w:szCs w:val="18"/>
               </w:rPr>
-              <w:t xml:space="preserve">Avoids cannibalization</w:t>
+              <w:t xml:space="preserve">Approve naming Hibbett Sports, UNFI, Zilliant, Exclaimer, etc.</w:t>
             </w:r>
           </w:p>
         </w:tc>
@@ -21606,7 +23826,7 @@
                 <w:sz w:val="18"/>
                 <w:szCs w:val="18"/>
               </w:rPr>
-              <w:t xml:space="preserve">Add a case study with before/after CSAT, FCR or cost-to-serve</w:t>
+              <w:t xml:space="preserve">Decide what happens to /customer-support-services and /contact-center-solutions</w:t>
             </w:r>
           </w:p>
         </w:tc>
@@ -21668,7 +23888,7 @@
                 <w:sz w:val="18"/>
                 <w:szCs w:val="18"/>
               </w:rPr>
-              <w:t xml:space="preserve">Strongest proof point</w:t>
+              <w:t xml:space="preserve">Avoids cannibalization</w:t>
             </w:r>
           </w:p>
         </w:tc>
@@ -21705,7 +23925,7 @@
                 <w:sz w:val="18"/>
                 <w:szCs w:val="18"/>
               </w:rPr>
-              <w:t xml:space="preserve">Build the page and video in team-solutions-site</w:t>
+              <w:t xml:space="preserve">Add a case study with before/after CSAT, FCR or cost-to-serve</w:t>
             </w:r>
           </w:p>
         </w:tc>
@@ -21737,6 +23957,105 @@
                 <w:sz w:val="18"/>
                 <w:szCs w:val="18"/>
               </w:rPr>
+              <w:t xml:space="preserve">Marketing</w:t>
+            </w:r>
+          </w:p>
+        </w:tc>
+        <w:tc>
+          <w:tcPr>
+            <w:tcW w:type="dxa" w:w="3560"/>
+            <w:tcBorders>
+              <w:top w:val="single" w:color="D9D3D7" w:sz="4"/>
+              <w:left w:val="single" w:color="D9D3D7" w:sz="4"/>
+              <w:bottom w:val="single" w:color="D9D3D7" w:sz="4"/>
+              <w:right w:val="single" w:color="D9D3D7" w:sz="4"/>
+            </w:tcBorders>
+            <w:shd w:fill="F7F4F6" w:color="auto" w:val="clear"/>
+            <w:tcMar>
+              <w:top w:type="dxa" w:w="70"/>
+              <w:left w:type="dxa" w:w="100"/>
+              <w:bottom w:type="dxa" w:w="70"/>
+              <w:right w:type="dxa" w:w="100"/>
+            </w:tcMar>
+          </w:tcPr>
+          <w:p>
+            <w:pPr>
+              <w:jc w:val="left"/>
+            </w:pPr>
+            <w:r>
+              <w:rPr>
+                <w:rFonts w:ascii="Aptos" w:cs="Aptos" w:eastAsia="Aptos" w:hAnsi="Aptos"/>
+                <w:color w:val="2F282D"/>
+                <w:sz w:val="18"/>
+                <w:szCs w:val="18"/>
+              </w:rPr>
+              <w:t xml:space="preserve">Strongest proof point</w:t>
+            </w:r>
+          </w:p>
+        </w:tc>
+      </w:tr>
+      <w:tr>
+        <w:trPr>
+          <w:cantSplit/>
+        </w:trPr>
+        <w:tc>
+          <w:tcPr>
+            <w:tcW w:type="dxa" w:w="4300"/>
+            <w:tcBorders>
+              <w:top w:val="single" w:color="D9D3D7" w:sz="4"/>
+              <w:left w:val="single" w:color="D9D3D7" w:sz="4"/>
+              <w:bottom w:val="single" w:color="D9D3D7" w:sz="4"/>
+              <w:right w:val="single" w:color="D9D3D7" w:sz="4"/>
+            </w:tcBorders>
+            <w:tcMar>
+              <w:top w:type="dxa" w:w="70"/>
+              <w:left w:type="dxa" w:w="100"/>
+              <w:bottom w:type="dxa" w:w="70"/>
+              <w:right w:type="dxa" w:w="100"/>
+            </w:tcMar>
+          </w:tcPr>
+          <w:p>
+            <w:pPr>
+              <w:jc w:val="left"/>
+            </w:pPr>
+            <w:r>
+              <w:rPr>
+                <w:rFonts w:ascii="Aptos" w:cs="Aptos" w:eastAsia="Aptos" w:hAnsi="Aptos"/>
+                <w:color w:val="2F282D"/>
+                <w:sz w:val="18"/>
+                <w:szCs w:val="18"/>
+              </w:rPr>
+              <w:t xml:space="preserve">Page and video: BUILT in team-solutions-site (/solutions/customer-care-technical-support)</w:t>
+            </w:r>
+          </w:p>
+        </w:tc>
+        <w:tc>
+          <w:tcPr>
+            <w:tcW w:type="dxa" w:w="1500"/>
+            <w:tcBorders>
+              <w:top w:val="single" w:color="D9D3D7" w:sz="4"/>
+              <w:left w:val="single" w:color="D9D3D7" w:sz="4"/>
+              <w:bottom w:val="single" w:color="D9D3D7" w:sz="4"/>
+              <w:right w:val="single" w:color="D9D3D7" w:sz="4"/>
+            </w:tcBorders>
+            <w:tcMar>
+              <w:top w:type="dxa" w:w="70"/>
+              <w:left w:type="dxa" w:w="100"/>
+              <w:bottom w:type="dxa" w:w="70"/>
+              <w:right w:type="dxa" w:w="100"/>
+            </w:tcMar>
+          </w:tcPr>
+          <w:p>
+            <w:pPr>
+              <w:jc w:val="left"/>
+            </w:pPr>
+            <w:r>
+              <w:rPr>
+                <w:rFonts w:ascii="Aptos" w:cs="Aptos" w:eastAsia="Aptos" w:hAnsi="Aptos"/>
+                <w:color w:val="2F282D"/>
+                <w:sz w:val="18"/>
+                <w:szCs w:val="18"/>
+              </w:rPr>
               <w:t xml:space="preserve">Web</w:t>
             </w:r>
           </w:p>
@@ -21750,26 +24069,25 @@
               <w:bottom w:val="single" w:color="D9D3D7" w:sz="4"/>
               <w:right w:val="single" w:color="D9D3D7" w:sz="4"/>
             </w:tcBorders>
-            <w:shd w:fill="F7F4F6" w:color="auto" w:val="clear"/>
-            <w:tcMar>
-              <w:top w:type="dxa" w:w="70"/>
-              <w:left w:type="dxa" w:w="100"/>
-              <w:bottom w:type="dxa" w:w="70"/>
-              <w:right w:type="dxa" w:w="100"/>
-            </w:tcMar>
-          </w:tcPr>
-          <w:p>
-            <w:pPr>
-              <w:jc w:val="left"/>
-            </w:pPr>
-            <w:r>
-              <w:rPr>
-                <w:rFonts w:ascii="Aptos" w:cs="Aptos" w:eastAsia="Aptos" w:hAnsi="Aptos"/>
-                <w:color w:val="2F282D"/>
-                <w:sz w:val="18"/>
-                <w:szCs w:val="18"/>
-              </w:rPr>
-              <w:t xml:space="preserve">Next step after approval</w:t>
+            <w:tcMar>
+              <w:top w:type="dxa" w:w="70"/>
+              <w:left w:type="dxa" w:w="100"/>
+              <w:bottom w:type="dxa" w:w="70"/>
+              <w:right w:type="dxa" w:w="100"/>
+            </w:tcMar>
+          </w:tcPr>
+          <w:p>
+            <w:pPr>
+              <w:jc w:val="left"/>
+            </w:pPr>
+            <w:r>
+              <w:rPr>
+                <w:rFonts w:ascii="Aptos" w:cs="Aptos" w:eastAsia="Aptos" w:hAnsi="Aptos"/>
+                <w:color w:val="2F282D"/>
+                <w:sz w:val="18"/>
+                <w:szCs w:val="18"/>
+              </w:rPr>
+              <w:t xml:space="preserve">Review on Vercel after git push</w:t>
             </w:r>
           </w:p>
         </w:tc>
@@ -21795,7 +24113,7 @@
         </w:numPr>
         <w:spacing w:after="80"/>
       </w:pPr>
-      <w:hyperlink w:history="1" r:id="rIdwybni9suh10zpmivcfcas">
+      <w:hyperlink w:history="1" r:id="rIdzo2ojbbqlj1izxhb_krvn">
         <w:r>
           <w:rPr>
             <w:rFonts w:ascii="Aptos" w:cs="Aptos" w:eastAsia="Aptos" w:hAnsi="Aptos"/>
@@ -21817,7 +24135,7 @@
         </w:numPr>
         <w:spacing w:after="80"/>
       </w:pPr>
-      <w:hyperlink w:history="1" r:id="rIdclqlh85kkl8xgtx2af9ci">
+      <w:hyperlink w:history="1" r:id="rIdrgt2-kepdafrncphiacjv">
         <w:r>
           <w:rPr>
             <w:rFonts w:ascii="Aptos" w:cs="Aptos" w:eastAsia="Aptos" w:hAnsi="Aptos"/>
@@ -21839,7 +24157,7 @@
         </w:numPr>
         <w:spacing w:after="80"/>
       </w:pPr>
-      <w:hyperlink w:history="1" r:id="rIdei3vaghdopvzyqsagwx77">
+      <w:hyperlink w:history="1" r:id="rIdhrl3wreyjcae84gcveisj">
         <w:r>
           <w:rPr>
             <w:rFonts w:ascii="Aptos" w:cs="Aptos" w:eastAsia="Aptos" w:hAnsi="Aptos"/>
@@ -21861,7 +24179,51 @@
         </w:numPr>
         <w:spacing w:after="80"/>
       </w:pPr>
-      <w:hyperlink w:history="1" r:id="rIdvkl8bxojcf4vztxrpuyg1">
+      <w:hyperlink w:history="1" r:id="rIdni8ftpilwwxg-ygy894tb">
+        <w:r>
+          <w:rPr>
+            <w:rFonts w:ascii="Aptos" w:cs="Aptos" w:eastAsia="Aptos" w:hAnsi="Aptos"/>
+            <w:color w:val="3939E3"/>
+            <w:sz w:val="21"/>
+            <w:szCs w:val="21"/>
+            <w:u w:val="single"/>
+          </w:rPr>
+          <w:t xml:space="preserve">TEAM International: Compliance &amp; Security (ISO/IEC 27001:2022, HIPAA, GDPR)</w:t>
+        </w:r>
+      </w:hyperlink>
+    </w:p>
+    <w:p>
+      <w:pPr>
+        <w:pStyle w:val="ListParagraph"/>
+        <w:numPr>
+          <w:ilvl w:val="0"/>
+          <w:numId w:val="2"/>
+        </w:numPr>
+        <w:spacing w:after="80"/>
+      </w:pPr>
+      <w:hyperlink w:history="1" r:id="rId6uomgcnubifkfth_adkew">
+        <w:r>
+          <w:rPr>
+            <w:rFonts w:ascii="Aptos" w:cs="Aptos" w:eastAsia="Aptos" w:hAnsi="Aptos"/>
+            <w:color w:val="3939E3"/>
+            <w:sz w:val="21"/>
+            <w:szCs w:val="21"/>
+            <w:u w:val="single"/>
+          </w:rPr>
+          <w:t xml:space="preserve">TEAM International: Customer Support Services (current page; coverage tiers and channels)</w:t>
+        </w:r>
+      </w:hyperlink>
+    </w:p>
+    <w:p>
+      <w:pPr>
+        <w:pStyle w:val="ListParagraph"/>
+        <w:numPr>
+          <w:ilvl w:val="0"/>
+          <w:numId w:val="2"/>
+        </w:numPr>
+        <w:spacing w:after="80"/>
+      </w:pPr>
+      <w:hyperlink w:history="1" r:id="rIdk6wye_qkwaieb5d6j8nbi">
         <w:r>
           <w:rPr>
             <w:rFonts w:ascii="Aptos" w:cs="Aptos" w:eastAsia="Aptos" w:hAnsi="Aptos"/>
@@ -21873,6 +24235,25 @@
           <w:t xml:space="preserve">Scrunch: What is the Agent Experience Platform (AXP)</w:t>
         </w:r>
       </w:hyperlink>
+    </w:p>
+    <w:p>
+      <w:pPr>
+        <w:pStyle w:val="ListParagraph"/>
+        <w:numPr>
+          <w:ilvl w:val="0"/>
+          <w:numId w:val="2"/>
+        </w:numPr>
+        <w:spacing w:after="80" w:line="276"/>
+      </w:pPr>
+      <w:r>
+        <w:rPr>
+          <w:rFonts w:ascii="Aptos" w:cs="Aptos" w:eastAsia="Aptos" w:hAnsi="Aptos"/>
+          <w:color w:val="2F282D"/>
+          <w:sz w:val="21"/>
+          <w:szCs w:val="21"/>
+        </w:rPr>
+        <w:t xml:space="preserve">Internal: Solutions Offerings - 2026.xlsx, tabs "Contact Center Services" and "Contact Center Projects" (project folder)</w:t>
+      </w:r>
     </w:p>
     <w:sectPr>
       <w:footerReference w:type="default" r:id="rId7"/>

</xml_diff>